<commit_message>
adjust lab01 report format
</commit_message>
<xml_diff>
--- a/labs/lab_report/finished_report/266430069 段辉园 javaweb实验1.docx
+++ b/labs/lab_report/finished_report/266430069 段辉园 javaweb实验1.docx
@@ -154,7 +154,6 @@
         </w:rPr>
         <w:t xml:space="preserve">    </w:t>
       </w:r>
-      <w:proofErr w:type="spellStart"/>
       <w:r>
         <w:rPr>
           <w:rFonts w:ascii="Times New Roman" w:eastAsia="宋体" w:hAnsi="Times New Roman" w:cs="Times New Roman" w:hint="eastAsia"/>
@@ -164,7 +163,6 @@
         </w:rPr>
         <w:t>javaweb</w:t>
       </w:r>
-      <w:proofErr w:type="spellEnd"/>
       <w:r>
         <w:rPr>
           <w:rFonts w:ascii="Times New Roman" w:eastAsia="宋体" w:hAnsi="Times New Roman" w:cs="Times New Roman" w:hint="eastAsia"/>
@@ -208,7 +206,6 @@
         </w:rPr>
         <w:t xml:space="preserve">      </w:t>
       </w:r>
-      <w:proofErr w:type="gramStart"/>
       <w:r>
         <w:rPr>
           <w:rFonts w:ascii="Times New Roman" w:eastAsia="宋体" w:hAnsi="Times New Roman" w:cs="Times New Roman" w:hint="eastAsia"/>
@@ -216,17 +213,7 @@
           <w:szCs w:val="24"/>
           <w:u w:val="single"/>
         </w:rPr>
-        <w:t>彭</w:t>
-      </w:r>
-      <w:proofErr w:type="gramEnd"/>
-      <w:r>
-        <w:rPr>
-          <w:rFonts w:ascii="Times New Roman" w:eastAsia="宋体" w:hAnsi="Times New Roman" w:cs="Times New Roman" w:hint="eastAsia"/>
-          <w:sz w:val="24"/>
-          <w:szCs w:val="24"/>
-          <w:u w:val="single"/>
-        </w:rPr>
-        <w:t>愿庆</w:t>
+        <w:t>彭愿庆</w:t>
       </w:r>
       <w:r>
         <w:rPr>
@@ -308,7 +295,6 @@
         </w:rPr>
         <w:t xml:space="preserve">   </w:t>
       </w:r>
-      <w:proofErr w:type="gramStart"/>
       <w:r>
         <w:rPr>
           <w:rFonts w:ascii="Times New Roman" w:eastAsia="宋体" w:hAnsi="Times New Roman" w:cs="Times New Roman" w:hint="eastAsia"/>
@@ -318,7 +304,6 @@
         </w:rPr>
         <w:t>段辉园</w:t>
       </w:r>
-      <w:proofErr w:type="gramEnd"/>
       <w:r>
         <w:rPr>
           <w:rFonts w:ascii="Times New Roman" w:eastAsia="宋体" w:hAnsi="Times New Roman" w:cs="Times New Roman"/>
@@ -353,7 +338,6 @@
         </w:rPr>
         <w:t xml:space="preserve">    </w:t>
       </w:r>
-      <w:proofErr w:type="gramStart"/>
       <w:r>
         <w:rPr>
           <w:rFonts w:ascii="Times New Roman" w:eastAsia="宋体" w:hAnsi="Times New Roman" w:cs="Times New Roman" w:hint="eastAsia"/>
@@ -363,7 +347,6 @@
         </w:rPr>
         <w:t>计科</w:t>
       </w:r>
-      <w:proofErr w:type="gramEnd"/>
       <w:r>
         <w:rPr>
           <w:rFonts w:ascii="Times New Roman" w:eastAsia="宋体" w:hAnsi="Times New Roman" w:cs="Times New Roman" w:hint="eastAsia"/>
@@ -556,17 +539,8 @@
                 <w:rFonts w:ascii="Times New Roman" w:eastAsia="等线" w:hAnsi="Times New Roman" w:cs="Times New Roman" w:hint="eastAsia"/>
                 <w:szCs w:val="21"/>
               </w:rPr>
-              <w:t>实验</w:t>
-            </w:r>
-            <w:proofErr w:type="gramStart"/>
-            <w:r>
-              <w:rPr>
-                <w:rFonts w:ascii="Times New Roman" w:eastAsia="等线" w:hAnsi="Times New Roman" w:cs="Times New Roman" w:hint="eastAsia"/>
-                <w:szCs w:val="21"/>
-              </w:rPr>
-              <w:t>一</w:t>
-            </w:r>
-            <w:proofErr w:type="gramEnd"/>
+              <w:t>实验一</w:t>
+            </w:r>
             <w:r>
               <w:rPr>
                 <w:rFonts w:ascii="Times New Roman" w:eastAsia="等线" w:hAnsi="Times New Roman" w:cs="Times New Roman" w:hint="eastAsia"/>
@@ -579,17 +553,8 @@
                 <w:rFonts w:ascii="Times New Roman" w:eastAsia="等线" w:hAnsi="Times New Roman" w:cs="Times New Roman"/>
                 <w:szCs w:val="21"/>
               </w:rPr>
-              <w:t xml:space="preserve"> </w:t>
-            </w:r>
-            <w:proofErr w:type="spellStart"/>
-            <w:r>
-              <w:rPr>
-                <w:rFonts w:ascii="Times New Roman" w:eastAsia="等线" w:hAnsi="Times New Roman" w:cs="Times New Roman"/>
-                <w:szCs w:val="21"/>
-              </w:rPr>
-              <w:t>JavaWeb</w:t>
-            </w:r>
-            <w:proofErr w:type="spellEnd"/>
+              <w:t xml:space="preserve"> JavaWeb</w:t>
+            </w:r>
             <w:r>
               <w:rPr>
                 <w:rFonts w:ascii="Times New Roman" w:eastAsia="等线" w:hAnsi="Times New Roman" w:cs="Times New Roman" w:hint="eastAsia"/>
@@ -1109,23 +1074,7 @@
                 <w:rFonts w:ascii="Times New Roman" w:eastAsia="等线" w:hAnsi="Times New Roman" w:cs="Times New Roman" w:hint="eastAsia"/>
                 <w:szCs w:val="21"/>
               </w:rPr>
-              <w:t>要求：截</w:t>
-            </w:r>
-            <w:proofErr w:type="gramStart"/>
-            <w:r>
-              <w:rPr>
-                <w:rFonts w:ascii="Times New Roman" w:eastAsia="等线" w:hAnsi="Times New Roman" w:cs="Times New Roman" w:hint="eastAsia"/>
-                <w:szCs w:val="21"/>
-              </w:rPr>
-              <w:t>图记录</w:t>
-            </w:r>
-            <w:proofErr w:type="gramEnd"/>
-            <w:r>
-              <w:rPr>
-                <w:rFonts w:ascii="Times New Roman" w:eastAsia="等线" w:hAnsi="Times New Roman" w:cs="Times New Roman" w:hint="eastAsia"/>
-                <w:szCs w:val="21"/>
-              </w:rPr>
-              <w:t>安装过程，并对重要目录进行说明</w:t>
+              <w:t>要求：截图记录安装过程，并对重要目录进行说明</w:t>
             </w:r>
           </w:p>
           <w:p>
@@ -1154,7 +1103,6 @@
               </w:rPr>
               <w:t>答：到</w:t>
             </w:r>
-            <w:proofErr w:type="spellStart"/>
             <w:r>
               <w:rPr>
                 <w:rFonts w:ascii="Times New Roman" w:eastAsia="等线" w:hAnsi="Times New Roman" w:cs="Times New Roman" w:hint="eastAsia"/>
@@ -1162,22 +1110,12 @@
               </w:rPr>
               <w:t>apache</w:t>
             </w:r>
-            <w:proofErr w:type="spellEnd"/>
-            <w:proofErr w:type="gramStart"/>
-            <w:r>
-              <w:rPr>
-                <w:rFonts w:ascii="Times New Roman" w:eastAsia="等线" w:hAnsi="Times New Roman" w:cs="Times New Roman" w:hint="eastAsia"/>
-                <w:szCs w:val="21"/>
-              </w:rPr>
-              <w:t>官网下载</w:t>
-            </w:r>
-            <w:proofErr w:type="gramEnd"/>
-            <w:r>
-              <w:rPr>
-                <w:rFonts w:ascii="Times New Roman" w:eastAsia="等线" w:hAnsi="Times New Roman" w:cs="Times New Roman" w:hint="eastAsia"/>
-                <w:szCs w:val="21"/>
-              </w:rPr>
-              <w:t>指定版本</w:t>
+            <w:r>
+              <w:rPr>
+                <w:rFonts w:ascii="Times New Roman" w:eastAsia="等线" w:hAnsi="Times New Roman" w:cs="Times New Roman" w:hint="eastAsia"/>
+                <w:szCs w:val="21"/>
+              </w:rPr>
+              <w:t>官网下载指定版本</w:t>
             </w:r>
             <w:r>
               <w:rPr>
@@ -1274,7 +1212,6 @@
                 <w:rFonts w:ascii="Times New Roman" w:eastAsia="等线" w:hAnsi="Times New Roman" w:cs="Times New Roman" w:hint="eastAsia"/>
                 <w:szCs w:val="21"/>
               </w:rPr>
-              <w:lastRenderedPageBreak/>
               <w:t>截图：</w:t>
             </w:r>
           </w:p>
@@ -1467,11 +1404,22 @@
                 <w:szCs w:val="21"/>
               </w:rPr>
             </w:pPr>
-            <w:r>
-              <w:rPr>
-                <w:rFonts w:ascii="Times New Roman" w:eastAsia="等线" w:hAnsi="Times New Roman" w:cs="Times New Roman" w:hint="eastAsia"/>
-                <w:szCs w:val="21"/>
-              </w:rPr>
+          </w:p>
+          <w:p>
+            <w:pPr>
+              <w:spacing w:line="276" w:lineRule="auto"/>
+              <w:ind w:right="1123" w:firstLineChars="200" w:firstLine="420"/>
+              <w:rPr>
+                <w:rFonts w:ascii="Times New Roman" w:eastAsia="等线" w:hAnsi="Times New Roman" w:cs="Times New Roman"/>
+                <w:szCs w:val="21"/>
+              </w:rPr>
+            </w:pPr>
+            <w:r>
+              <w:rPr>
+                <w:rFonts w:ascii="Times New Roman" w:eastAsia="等线" w:hAnsi="Times New Roman" w:cs="Times New Roman" w:hint="eastAsia"/>
+                <w:szCs w:val="21"/>
+              </w:rPr>
+              <w:lastRenderedPageBreak/>
               <w:t>运行</w:t>
             </w:r>
             <w:r>
@@ -1504,7 +1452,6 @@
                 <w:noProof/>
                 <w:szCs w:val="21"/>
               </w:rPr>
-              <w:lastRenderedPageBreak/>
               <w:drawing>
                 <wp:inline distT="0" distB="0" distL="0" distR="0" wp14:anchorId="0599DCE2" wp14:editId="7ABB8D62">
                   <wp:extent cx="5278120" cy="2889250"/>
@@ -1547,7 +1494,7 @@
               <w:spacing w:line="276" w:lineRule="auto"/>
               <w:ind w:right="1123" w:firstLineChars="200" w:firstLine="420"/>
               <w:rPr>
-                <w:rFonts w:ascii="Times New Roman" w:eastAsia="等线" w:hAnsi="Times New Roman" w:cs="Times New Roman" w:hint="eastAsia"/>
+                <w:rFonts w:ascii="Times New Roman" w:eastAsia="等线" w:hAnsi="Times New Roman" w:cs="Times New Roman"/>
                 <w:szCs w:val="21"/>
               </w:rPr>
             </w:pPr>
@@ -1622,23 +1569,7 @@
                 <w:rFonts w:ascii="Times New Roman" w:eastAsia="等线" w:hAnsi="Times New Roman" w:cs="Times New Roman" w:hint="eastAsia"/>
                 <w:szCs w:val="21"/>
               </w:rPr>
-              <w:t xml:space="preserve"> .</w:t>
-            </w:r>
-            <w:proofErr w:type="spellStart"/>
-            <w:r>
-              <w:rPr>
-                <w:rFonts w:ascii="Times New Roman" w:eastAsia="等线" w:hAnsi="Times New Roman" w:cs="Times New Roman" w:hint="eastAsia"/>
-                <w:szCs w:val="21"/>
-              </w:rPr>
-              <w:t>sh</w:t>
-            </w:r>
-            <w:proofErr w:type="spellEnd"/>
-            <w:r>
-              <w:rPr>
-                <w:rFonts w:ascii="Times New Roman" w:eastAsia="等线" w:hAnsi="Times New Roman" w:cs="Times New Roman" w:hint="eastAsia"/>
-                <w:szCs w:val="21"/>
-              </w:rPr>
-              <w:t xml:space="preserve"> (Linux/Unix) </w:t>
+              <w:t xml:space="preserve"> .sh (Linux/Unix) </w:t>
             </w:r>
             <w:r>
               <w:rPr>
@@ -1708,23 +1639,7 @@
                 <w:rFonts w:ascii="Times New Roman" w:eastAsia="等线" w:hAnsi="Times New Roman" w:cs="Times New Roman" w:hint="eastAsia"/>
                 <w:szCs w:val="21"/>
               </w:rPr>
-              <w:t xml:space="preserve"> </w:t>
-            </w:r>
-            <w:proofErr w:type="spellStart"/>
-            <w:r>
-              <w:rPr>
-                <w:rFonts w:ascii="Times New Roman" w:eastAsia="等线" w:hAnsi="Times New Roman" w:cs="Times New Roman" w:hint="eastAsia"/>
-                <w:szCs w:val="21"/>
-              </w:rPr>
-              <w:t>catalina</w:t>
-            </w:r>
-            <w:proofErr w:type="spellEnd"/>
-            <w:r>
-              <w:rPr>
-                <w:rFonts w:ascii="Times New Roman" w:eastAsia="等线" w:hAnsi="Times New Roman" w:cs="Times New Roman" w:hint="eastAsia"/>
-                <w:szCs w:val="21"/>
-              </w:rPr>
-              <w:t xml:space="preserve"> </w:t>
+              <w:t xml:space="preserve"> catalina </w:t>
             </w:r>
             <w:r>
               <w:rPr>
@@ -1739,7 +1654,7 @@
               <w:spacing w:line="276" w:lineRule="auto"/>
               <w:ind w:right="1123" w:firstLineChars="200" w:firstLine="420"/>
               <w:rPr>
-                <w:rFonts w:ascii="Times New Roman" w:eastAsia="等线" w:hAnsi="Times New Roman" w:cs="Times New Roman" w:hint="eastAsia"/>
+                <w:rFonts w:ascii="Times New Roman" w:eastAsia="等线" w:hAnsi="Times New Roman" w:cs="Times New Roman"/>
                 <w:szCs w:val="21"/>
               </w:rPr>
             </w:pPr>
@@ -1808,7 +1723,7 @@
               <w:spacing w:line="276" w:lineRule="auto"/>
               <w:ind w:right="1123" w:firstLineChars="200" w:firstLine="420"/>
               <w:rPr>
-                <w:rFonts w:ascii="Times New Roman" w:eastAsia="等线" w:hAnsi="Times New Roman" w:cs="Times New Roman" w:hint="eastAsia"/>
+                <w:rFonts w:ascii="Times New Roman" w:eastAsia="等线" w:hAnsi="Times New Roman" w:cs="Times New Roman"/>
                 <w:szCs w:val="21"/>
               </w:rPr>
             </w:pPr>
@@ -1891,7 +1806,7 @@
               <w:spacing w:line="276" w:lineRule="auto"/>
               <w:ind w:right="1123" w:firstLineChars="200" w:firstLine="420"/>
               <w:rPr>
-                <w:rFonts w:ascii="Times New Roman" w:eastAsia="等线" w:hAnsi="Times New Roman" w:cs="Times New Roman" w:hint="eastAsia"/>
+                <w:rFonts w:ascii="Times New Roman" w:eastAsia="等线" w:hAnsi="Times New Roman" w:cs="Times New Roman"/>
                 <w:szCs w:val="21"/>
               </w:rPr>
             </w:pPr>
@@ -1995,7 +1910,7 @@
               <w:spacing w:line="276" w:lineRule="auto"/>
               <w:ind w:right="1123" w:firstLineChars="200" w:firstLine="420"/>
               <w:rPr>
-                <w:rFonts w:ascii="Times New Roman" w:eastAsia="等线" w:hAnsi="Times New Roman" w:cs="Times New Roman" w:hint="eastAsia"/>
+                <w:rFonts w:ascii="Times New Roman" w:eastAsia="等线" w:hAnsi="Times New Roman" w:cs="Times New Roman"/>
                 <w:szCs w:val="21"/>
               </w:rPr>
             </w:pPr>
@@ -2355,23 +2270,8 @@
                 <w:rFonts w:ascii="Times New Roman" w:eastAsia="等线" w:hAnsi="Times New Roman" w:cs="Times New Roman" w:hint="eastAsia"/>
                 <w:szCs w:val="21"/>
               </w:rPr>
-              <w:t>要求：截</w:t>
-            </w:r>
-            <w:proofErr w:type="gramStart"/>
-            <w:r>
-              <w:rPr>
-                <w:rFonts w:ascii="Times New Roman" w:eastAsia="等线" w:hAnsi="Times New Roman" w:cs="Times New Roman" w:hint="eastAsia"/>
-                <w:szCs w:val="21"/>
-              </w:rPr>
-              <w:t>图记录</w:t>
-            </w:r>
-            <w:proofErr w:type="gramEnd"/>
-            <w:r>
-              <w:rPr>
-                <w:rFonts w:ascii="Times New Roman" w:eastAsia="等线" w:hAnsi="Times New Roman" w:cs="Times New Roman" w:hint="eastAsia"/>
-                <w:szCs w:val="21"/>
-              </w:rPr>
-              <w:t>在</w:t>
+              <w:lastRenderedPageBreak/>
+              <w:t>要求：截图记录在</w:t>
             </w:r>
             <w:r>
               <w:rPr>
@@ -2506,8 +2406,9 @@
                 <w:noProof/>
                 <w:szCs w:val="21"/>
               </w:rPr>
+              <w:lastRenderedPageBreak/>
               <w:drawing>
-                <wp:inline distT="0" distB="0" distL="0" distR="0" wp14:anchorId="132C9F01" wp14:editId="4C24B25A">
+                <wp:inline distT="0" distB="0" distL="0" distR="0" wp14:anchorId="132C9F01" wp14:editId="13B0EB51">
                   <wp:extent cx="5278120" cy="3711575"/>
                   <wp:effectExtent l="0" t="0" r="0" b="3175"/>
                   <wp:docPr id="13" name="图片 13"/>
@@ -2564,9 +2465,8 @@
                 <w:noProof/>
                 <w:szCs w:val="21"/>
               </w:rPr>
-              <w:lastRenderedPageBreak/>
               <w:drawing>
-                <wp:inline distT="0" distB="0" distL="0" distR="0" wp14:anchorId="4BC3EF7F" wp14:editId="3DBB0E69">
+                <wp:inline distT="0" distB="0" distL="0" distR="0" wp14:anchorId="4BC3EF7F" wp14:editId="406F94EC">
                   <wp:extent cx="5278120" cy="3714115"/>
                   <wp:effectExtent l="0" t="0" r="0" b="635"/>
                   <wp:docPr id="14" name="图片 14"/>
@@ -2674,23 +2574,7 @@
                 <w:rFonts w:ascii="Times New Roman" w:eastAsia="等线" w:hAnsi="Times New Roman" w:cs="Times New Roman" w:hint="eastAsia"/>
                 <w:szCs w:val="21"/>
               </w:rPr>
-              <w:t>要求：截</w:t>
-            </w:r>
-            <w:proofErr w:type="gramStart"/>
-            <w:r>
-              <w:rPr>
-                <w:rFonts w:ascii="Times New Roman" w:eastAsia="等线" w:hAnsi="Times New Roman" w:cs="Times New Roman" w:hint="eastAsia"/>
-                <w:szCs w:val="21"/>
-              </w:rPr>
-              <w:t>图记录</w:t>
-            </w:r>
-            <w:proofErr w:type="gramEnd"/>
-            <w:r>
-              <w:rPr>
-                <w:rFonts w:ascii="Times New Roman" w:eastAsia="等线" w:hAnsi="Times New Roman" w:cs="Times New Roman" w:hint="eastAsia"/>
-                <w:szCs w:val="21"/>
-              </w:rPr>
-              <w:t>在</w:t>
+              <w:t>要求：截图记录在</w:t>
             </w:r>
             <w:r>
               <w:rPr>
@@ -2753,6 +2637,7 @@
                 <w:noProof/>
                 <w:szCs w:val="21"/>
               </w:rPr>
+              <w:lastRenderedPageBreak/>
               <w:drawing>
                 <wp:inline distT="0" distB="0" distL="0" distR="0" wp14:anchorId="4FA96FD9" wp14:editId="7CD4EB6E">
                   <wp:extent cx="5278120" cy="3882788"/>
@@ -2805,7 +2690,6 @@
                 <w:noProof/>
                 <w:szCs w:val="21"/>
               </w:rPr>
-              <w:lastRenderedPageBreak/>
               <w:drawing>
                 <wp:inline distT="0" distB="0" distL="0" distR="0" wp14:anchorId="08AF2405" wp14:editId="3D8E4844">
                   <wp:extent cx="5278120" cy="3841750"/>
@@ -2924,41 +2808,8 @@
                 <w:rFonts w:ascii="Times New Roman" w:eastAsia="等线" w:hAnsi="Times New Roman" w:cs="Times New Roman" w:hint="eastAsia"/>
                 <w:szCs w:val="21"/>
               </w:rPr>
-              <w:t>2</w:t>
-            </w:r>
-            <w:r>
-              <w:rPr>
-                <w:rFonts w:ascii="Times New Roman" w:eastAsia="等线" w:hAnsi="Times New Roman" w:cs="Times New Roman" w:hint="eastAsia"/>
-                <w:szCs w:val="21"/>
-              </w:rPr>
-              <w:t>、设计注册页面</w:t>
-            </w:r>
-          </w:p>
-          <w:p>
-            <w:pPr>
-              <w:spacing w:line="276" w:lineRule="auto"/>
-              <w:ind w:right="1123" w:firstLineChars="200" w:firstLine="420"/>
-              <w:rPr>
-                <w:rFonts w:ascii="Times New Roman" w:eastAsia="等线" w:hAnsi="Times New Roman" w:cs="Times New Roman"/>
-                <w:szCs w:val="21"/>
-              </w:rPr>
-            </w:pPr>
-            <w:r>
-              <w:rPr>
-                <w:rFonts w:ascii="Times New Roman" w:eastAsia="等线" w:hAnsi="Times New Roman" w:cs="Times New Roman" w:hint="eastAsia"/>
-                <w:szCs w:val="21"/>
-              </w:rPr>
-              <w:t>要求：截</w:t>
-            </w:r>
-            <w:proofErr w:type="gramStart"/>
-            <w:r>
-              <w:rPr>
-                <w:rFonts w:ascii="Times New Roman" w:eastAsia="等线" w:hAnsi="Times New Roman" w:cs="Times New Roman" w:hint="eastAsia"/>
-                <w:szCs w:val="21"/>
-              </w:rPr>
-              <w:t>图记录</w:t>
-            </w:r>
-            <w:proofErr w:type="gramEnd"/>
+              <w:t>要求：截图记录</w:t>
+            </w:r>
             <w:r>
               <w:rPr>
                 <w:rFonts w:ascii="Times New Roman" w:eastAsia="等线" w:hAnsi="Times New Roman" w:cs="Times New Roman" w:hint="eastAsia"/>
@@ -2988,6 +2839,7 @@
                 <w:rFonts w:ascii="Times New Roman" w:eastAsia="等线" w:hAnsi="Times New Roman" w:cs="Times New Roman" w:hint="eastAsia"/>
                 <w:szCs w:val="21"/>
               </w:rPr>
+              <w:lastRenderedPageBreak/>
               <w:t>答：</w:t>
             </w:r>
           </w:p>
@@ -3007,7 +2859,6 @@
               </w:rPr>
               <w:t>创建</w:t>
             </w:r>
-            <w:proofErr w:type="spellStart"/>
             <w:r>
               <w:rPr>
                 <w:rFonts w:ascii="Times New Roman" w:eastAsia="等线" w:hAnsi="Times New Roman" w:cs="Times New Roman" w:hint="eastAsia"/>
@@ -3015,7 +2866,6 @@
               </w:rPr>
               <w:t>jsp</w:t>
             </w:r>
-            <w:proofErr w:type="spellEnd"/>
             <w:r>
               <w:rPr>
                 <w:rFonts w:ascii="Times New Roman" w:eastAsia="等线" w:hAnsi="Times New Roman" w:cs="Times New Roman" w:hint="eastAsia"/>
@@ -3096,7 +2946,6 @@
                 <w:rFonts w:ascii="Times New Roman" w:eastAsia="等线" w:hAnsi="Times New Roman" w:cs="Times New Roman" w:hint="eastAsia"/>
                 <w:szCs w:val="21"/>
               </w:rPr>
-              <w:lastRenderedPageBreak/>
               <w:t>创建登录页面</w:t>
             </w:r>
           </w:p>
@@ -3190,6 +3039,7 @@
                 <w:noProof/>
                 <w:szCs w:val="21"/>
               </w:rPr>
+              <w:lastRenderedPageBreak/>
               <w:drawing>
                 <wp:inline distT="0" distB="0" distL="0" distR="0" wp14:anchorId="46547338" wp14:editId="092C82FF">
                   <wp:extent cx="5278120" cy="3042285"/>
@@ -3247,17 +3097,8 @@
                 <w:rFonts w:ascii="Times New Roman" w:eastAsia="等线" w:hAnsi="Times New Roman" w:cs="Times New Roman" w:hint="eastAsia"/>
                 <w:szCs w:val="21"/>
               </w:rPr>
-              <w:t xml:space="preserve">index </w:t>
-            </w:r>
-            <w:proofErr w:type="spellStart"/>
-            <w:r>
-              <w:rPr>
-                <w:rFonts w:ascii="Times New Roman" w:eastAsia="等线" w:hAnsi="Times New Roman" w:cs="Times New Roman" w:hint="eastAsia"/>
-                <w:szCs w:val="21"/>
-              </w:rPr>
-              <w:t>jsp</w:t>
-            </w:r>
-            <w:proofErr w:type="spellEnd"/>
+              <w:t>index jsp</w:t>
+            </w:r>
             <w:r>
               <w:rPr>
                 <w:rFonts w:ascii="Times New Roman" w:eastAsia="等线" w:hAnsi="Times New Roman" w:cs="Times New Roman" w:hint="eastAsia"/>
@@ -3304,23 +3145,7 @@
                 <w:szCs w:val="21"/>
               </w:rPr>
               <w:br/>
-              <w:t xml:space="preserve">    &lt;h1&gt;Hello </w:t>
-            </w:r>
-            <w:proofErr w:type="gramStart"/>
-            <w:r>
-              <w:rPr>
-                <w:rFonts w:ascii="Times New Roman" w:eastAsia="等线" w:hAnsi="Times New Roman" w:cs="Times New Roman"/>
-                <w:szCs w:val="21"/>
-              </w:rPr>
-              <w:t>World!&lt;</w:t>
-            </w:r>
-            <w:proofErr w:type="gramEnd"/>
-            <w:r>
-              <w:rPr>
-                <w:rFonts w:ascii="Times New Roman" w:eastAsia="等线" w:hAnsi="Times New Roman" w:cs="Times New Roman"/>
-                <w:szCs w:val="21"/>
-              </w:rPr>
-              <w:t>/h1&gt;</w:t>
+              <w:t xml:space="preserve">    &lt;h1&gt;Hello World!&lt;/h1&gt;</w:t>
             </w:r>
             <w:r>
               <w:rPr>
@@ -3358,55 +3183,7 @@
                 <w:szCs w:val="21"/>
               </w:rPr>
               <w:br/>
-              <w:t xml:space="preserve">        &lt;a class="</w:t>
-            </w:r>
-            <w:proofErr w:type="spellStart"/>
-            <w:r>
-              <w:rPr>
-                <w:rFonts w:ascii="Times New Roman" w:eastAsia="等线" w:hAnsi="Times New Roman" w:cs="Times New Roman"/>
-                <w:szCs w:val="21"/>
-              </w:rPr>
-              <w:t>btn</w:t>
-            </w:r>
-            <w:proofErr w:type="spellEnd"/>
-            <w:r>
-              <w:rPr>
-                <w:rFonts w:ascii="Times New Roman" w:eastAsia="等线" w:hAnsi="Times New Roman" w:cs="Times New Roman"/>
-                <w:szCs w:val="21"/>
-              </w:rPr>
-              <w:t xml:space="preserve"> </w:t>
-            </w:r>
-            <w:proofErr w:type="spellStart"/>
-            <w:r>
-              <w:rPr>
-                <w:rFonts w:ascii="Times New Roman" w:eastAsia="等线" w:hAnsi="Times New Roman" w:cs="Times New Roman"/>
-                <w:szCs w:val="21"/>
-              </w:rPr>
-              <w:t>btn</w:t>
-            </w:r>
-            <w:proofErr w:type="spellEnd"/>
-            <w:r>
-              <w:rPr>
-                <w:rFonts w:ascii="Times New Roman" w:eastAsia="等线" w:hAnsi="Times New Roman" w:cs="Times New Roman"/>
-                <w:szCs w:val="21"/>
-              </w:rPr>
-              <w:t xml:space="preserve">-primary" </w:t>
-            </w:r>
-            <w:proofErr w:type="spellStart"/>
-            <w:r>
-              <w:rPr>
-                <w:rFonts w:ascii="Times New Roman" w:eastAsia="等线" w:hAnsi="Times New Roman" w:cs="Times New Roman"/>
-                <w:szCs w:val="21"/>
-              </w:rPr>
-              <w:t>href</w:t>
-            </w:r>
-            <w:proofErr w:type="spellEnd"/>
-            <w:r>
-              <w:rPr>
-                <w:rFonts w:ascii="Times New Roman" w:eastAsia="等线" w:hAnsi="Times New Roman" w:cs="Times New Roman"/>
-                <w:szCs w:val="21"/>
-              </w:rPr>
-              <w:t>="login.html"&gt;</w:t>
+              <w:t xml:space="preserve">        &lt;a class="btn btn-primary" href="login.html"&gt;</w:t>
             </w:r>
             <w:r>
               <w:rPr>
@@ -3428,55 +3205,7 @@
                 <w:szCs w:val="21"/>
               </w:rPr>
               <w:br/>
-              <w:t xml:space="preserve">        &lt;a class="</w:t>
-            </w:r>
-            <w:proofErr w:type="spellStart"/>
-            <w:r>
-              <w:rPr>
-                <w:rFonts w:ascii="Times New Roman" w:eastAsia="等线" w:hAnsi="Times New Roman" w:cs="Times New Roman"/>
-                <w:szCs w:val="21"/>
-              </w:rPr>
-              <w:t>btn</w:t>
-            </w:r>
-            <w:proofErr w:type="spellEnd"/>
-            <w:r>
-              <w:rPr>
-                <w:rFonts w:ascii="Times New Roman" w:eastAsia="等线" w:hAnsi="Times New Roman" w:cs="Times New Roman"/>
-                <w:szCs w:val="21"/>
-              </w:rPr>
-              <w:t xml:space="preserve"> </w:t>
-            </w:r>
-            <w:proofErr w:type="spellStart"/>
-            <w:r>
-              <w:rPr>
-                <w:rFonts w:ascii="Times New Roman" w:eastAsia="等线" w:hAnsi="Times New Roman" w:cs="Times New Roman"/>
-                <w:szCs w:val="21"/>
-              </w:rPr>
-              <w:t>btn</w:t>
-            </w:r>
-            <w:proofErr w:type="spellEnd"/>
-            <w:r>
-              <w:rPr>
-                <w:rFonts w:ascii="Times New Roman" w:eastAsia="等线" w:hAnsi="Times New Roman" w:cs="Times New Roman"/>
-                <w:szCs w:val="21"/>
-              </w:rPr>
-              <w:t xml:space="preserve">-ghost" </w:t>
-            </w:r>
-            <w:proofErr w:type="spellStart"/>
-            <w:r>
-              <w:rPr>
-                <w:rFonts w:ascii="Times New Roman" w:eastAsia="等线" w:hAnsi="Times New Roman" w:cs="Times New Roman"/>
-                <w:szCs w:val="21"/>
-              </w:rPr>
-              <w:t>href</w:t>
-            </w:r>
-            <w:proofErr w:type="spellEnd"/>
-            <w:r>
-              <w:rPr>
-                <w:rFonts w:ascii="Times New Roman" w:eastAsia="等线" w:hAnsi="Times New Roman" w:cs="Times New Roman"/>
-                <w:szCs w:val="21"/>
-              </w:rPr>
-              <w:t>="register.html"&gt;</w:t>
+              <w:t xml:space="preserve">        &lt;a class="btn btn-ghost" href="register.html"&gt;</w:t>
             </w:r>
             <w:r>
               <w:rPr>
@@ -3498,13 +3227,6 @@
                 <w:szCs w:val="21"/>
               </w:rPr>
               <w:br/>
-            </w:r>
-            <w:r>
-              <w:rPr>
-                <w:rFonts w:ascii="Times New Roman" w:eastAsia="等线" w:hAnsi="Times New Roman" w:cs="Times New Roman"/>
-                <w:szCs w:val="21"/>
-              </w:rPr>
-              <w:lastRenderedPageBreak/>
               <w:t xml:space="preserve">    &lt;/div&gt;</w:t>
             </w:r>
             <w:r>
@@ -3706,23 +3428,7 @@
                 <w:szCs w:val="21"/>
               </w:rPr>
               <w:br/>
-              <w:t xml:space="preserve">            &lt;label for="</w:t>
-            </w:r>
-            <w:proofErr w:type="spellStart"/>
-            <w:r>
-              <w:rPr>
-                <w:rFonts w:ascii="Times New Roman" w:eastAsia="等线" w:hAnsi="Times New Roman" w:cs="Times New Roman"/>
-                <w:szCs w:val="21"/>
-              </w:rPr>
-              <w:t>userName</w:t>
-            </w:r>
-            <w:proofErr w:type="spellEnd"/>
-            <w:r>
-              <w:rPr>
-                <w:rFonts w:ascii="Times New Roman" w:eastAsia="等线" w:hAnsi="Times New Roman" w:cs="Times New Roman"/>
-                <w:szCs w:val="21"/>
-              </w:rPr>
-              <w:t>"&gt;</w:t>
+              <w:t xml:space="preserve">            &lt;label for="userName"&gt;</w:t>
             </w:r>
             <w:r>
               <w:rPr>
@@ -3744,39 +3450,14 @@
                 <w:szCs w:val="21"/>
               </w:rPr>
               <w:br/>
-              <w:t xml:space="preserve">            &lt;input type="text" id="</w:t>
-            </w:r>
-            <w:proofErr w:type="spellStart"/>
-            <w:r>
-              <w:rPr>
-                <w:rFonts w:ascii="Times New Roman" w:eastAsia="等线" w:hAnsi="Times New Roman" w:cs="Times New Roman"/>
-                <w:szCs w:val="21"/>
-              </w:rPr>
-              <w:t>userName</w:t>
-            </w:r>
-            <w:proofErr w:type="spellEnd"/>
-            <w:r>
-              <w:rPr>
-                <w:rFonts w:ascii="Times New Roman" w:eastAsia="等线" w:hAnsi="Times New Roman" w:cs="Times New Roman"/>
-                <w:szCs w:val="21"/>
-              </w:rPr>
-              <w:t>" name="</w:t>
-            </w:r>
-            <w:proofErr w:type="spellStart"/>
-            <w:r>
-              <w:rPr>
-                <w:rFonts w:ascii="Times New Roman" w:eastAsia="等线" w:hAnsi="Times New Roman" w:cs="Times New Roman"/>
-                <w:szCs w:val="21"/>
-              </w:rPr>
-              <w:t>userName</w:t>
-            </w:r>
-            <w:proofErr w:type="spellEnd"/>
-            <w:r>
-              <w:rPr>
-                <w:rFonts w:ascii="Times New Roman" w:eastAsia="等线" w:hAnsi="Times New Roman" w:cs="Times New Roman"/>
-                <w:szCs w:val="21"/>
-              </w:rPr>
-              <w:t>" placeholder="</w:t>
+            </w:r>
+            <w:r>
+              <w:rPr>
+                <w:rFonts w:ascii="Times New Roman" w:eastAsia="等线" w:hAnsi="Times New Roman" w:cs="Times New Roman"/>
+                <w:szCs w:val="21"/>
+              </w:rPr>
+              <w:lastRenderedPageBreak/>
+              <w:t xml:space="preserve">            &lt;input type="text" id="userName" name="userName" placeholder="</w:t>
             </w:r>
             <w:r>
               <w:rPr>
@@ -3882,23 +3563,7 @@
                 <w:szCs w:val="21"/>
               </w:rPr>
               <w:br/>
-              <w:t xml:space="preserve">        &lt;button type="submit" class="</w:t>
-            </w:r>
-            <w:proofErr w:type="spellStart"/>
-            <w:r>
-              <w:rPr>
-                <w:rFonts w:ascii="Times New Roman" w:eastAsia="等线" w:hAnsi="Times New Roman" w:cs="Times New Roman"/>
-                <w:szCs w:val="21"/>
-              </w:rPr>
-              <w:t>btn</w:t>
-            </w:r>
-            <w:proofErr w:type="spellEnd"/>
-            <w:r>
-              <w:rPr>
-                <w:rFonts w:ascii="Times New Roman" w:eastAsia="等线" w:hAnsi="Times New Roman" w:cs="Times New Roman"/>
-                <w:szCs w:val="21"/>
-              </w:rPr>
-              <w:t>"&gt;</w:t>
+              <w:t xml:space="preserve">        &lt;button type="submit" class="btn"&gt;</w:t>
             </w:r>
             <w:r>
               <w:rPr>
@@ -3963,23 +3628,7 @@
                 <w:rFonts w:ascii="Times New Roman" w:eastAsia="等线" w:hAnsi="Times New Roman" w:cs="Times New Roman"/>
                 <w:szCs w:val="21"/>
               </w:rPr>
-              <w:t xml:space="preserve">&lt;a </w:t>
-            </w:r>
-            <w:proofErr w:type="spellStart"/>
-            <w:r>
-              <w:rPr>
-                <w:rFonts w:ascii="Times New Roman" w:eastAsia="等线" w:hAnsi="Times New Roman" w:cs="Times New Roman"/>
-                <w:szCs w:val="21"/>
-              </w:rPr>
-              <w:t>href</w:t>
-            </w:r>
-            <w:proofErr w:type="spellEnd"/>
-            <w:r>
-              <w:rPr>
-                <w:rFonts w:ascii="Times New Roman" w:eastAsia="等线" w:hAnsi="Times New Roman" w:cs="Times New Roman"/>
-                <w:szCs w:val="21"/>
-              </w:rPr>
-              <w:t>="register.html"&gt;</w:t>
+              <w:t>&lt;a href="register.html"&gt;</w:t>
             </w:r>
             <w:r>
               <w:rPr>
@@ -4015,6 +3664,40 @@
           <w:p>
             <w:pPr>
               <w:spacing w:line="276" w:lineRule="auto"/>
+              <w:ind w:leftChars="200" w:left="420" w:right="1123" w:firstLineChars="200" w:firstLine="420"/>
+              <w:rPr>
+                <w:rFonts w:ascii="Times New Roman" w:eastAsia="等线" w:hAnsi="Times New Roman" w:cs="Times New Roman"/>
+                <w:szCs w:val="21"/>
+              </w:rPr>
+            </w:pPr>
+          </w:p>
+          <w:p>
+            <w:pPr>
+              <w:spacing w:line="276" w:lineRule="auto"/>
+              <w:ind w:right="1123" w:firstLineChars="200" w:firstLine="420"/>
+              <w:rPr>
+                <w:rFonts w:ascii="Times New Roman" w:eastAsia="等线" w:hAnsi="Times New Roman" w:cs="Times New Roman"/>
+                <w:szCs w:val="21"/>
+              </w:rPr>
+            </w:pPr>
+            <w:r>
+              <w:rPr>
+                <w:rFonts w:ascii="Times New Roman" w:eastAsia="等线" w:hAnsi="Times New Roman" w:cs="Times New Roman" w:hint="eastAsia"/>
+                <w:szCs w:val="21"/>
+              </w:rPr>
+              <w:t>2</w:t>
+            </w:r>
+            <w:r>
+              <w:rPr>
+                <w:rFonts w:ascii="Times New Roman" w:eastAsia="等线" w:hAnsi="Times New Roman" w:cs="Times New Roman" w:hint="eastAsia"/>
+                <w:szCs w:val="21"/>
+              </w:rPr>
+              <w:t>、设计注册页面</w:t>
+            </w:r>
+          </w:p>
+          <w:p>
+            <w:pPr>
+              <w:spacing w:line="276" w:lineRule="auto"/>
               <w:ind w:right="1123" w:firstLineChars="200" w:firstLine="420"/>
               <w:rPr>
                 <w:rFonts w:ascii="Times New Roman" w:eastAsia="等线" w:hAnsi="Times New Roman" w:cs="Times New Roman"/>
@@ -4176,17 +3859,370 @@
                 <w:rFonts w:ascii="Times New Roman" w:eastAsia="等线" w:hAnsi="Times New Roman" w:cs="Times New Roman" w:hint="eastAsia"/>
                 <w:szCs w:val="21"/>
               </w:rPr>
-              <w:t xml:space="preserve">    </w:t>
-            </w:r>
-            <w:proofErr w:type="gramStart"/>
-            <w:r>
-              <w:rPr>
-                <w:rFonts w:ascii="Times New Roman" w:eastAsia="等线" w:hAnsi="Times New Roman" w:cs="Times New Roman" w:hint="eastAsia"/>
-                <w:szCs w:val="21"/>
-              </w:rPr>
-              <w:t>&lt;!--</w:t>
-            </w:r>
-            <w:proofErr w:type="gramEnd"/>
+              <w:t xml:space="preserve">    &lt;!-- </w:t>
+            </w:r>
+            <w:r>
+              <w:rPr>
+                <w:rFonts w:ascii="Times New Roman" w:eastAsia="等线" w:hAnsi="Times New Roman" w:cs="Times New Roman" w:hint="eastAsia"/>
+                <w:szCs w:val="21"/>
+              </w:rPr>
+              <w:t>注册需要后端</w:t>
+            </w:r>
+            <w:r>
+              <w:rPr>
+                <w:rFonts w:ascii="Times New Roman" w:eastAsia="等线" w:hAnsi="Times New Roman" w:cs="Times New Roman" w:hint="eastAsia"/>
+                <w:szCs w:val="21"/>
+              </w:rPr>
+              <w:t xml:space="preserve"> Servlet </w:t>
+            </w:r>
+            <w:r>
+              <w:rPr>
+                <w:rFonts w:ascii="Times New Roman" w:eastAsia="等线" w:hAnsi="Times New Roman" w:cs="Times New Roman" w:hint="eastAsia"/>
+                <w:szCs w:val="21"/>
+              </w:rPr>
+              <w:t>处理</w:t>
+            </w:r>
+            <w:r>
+              <w:rPr>
+                <w:rFonts w:ascii="Times New Roman" w:eastAsia="等线" w:hAnsi="Times New Roman" w:cs="Times New Roman" w:hint="eastAsia"/>
+                <w:szCs w:val="21"/>
+              </w:rPr>
+              <w:t xml:space="preserve"> /register</w:t>
+            </w:r>
+            <w:r>
+              <w:rPr>
+                <w:rFonts w:ascii="Times New Roman" w:eastAsia="等线" w:hAnsi="Times New Roman" w:cs="Times New Roman" w:hint="eastAsia"/>
+                <w:szCs w:val="21"/>
+              </w:rPr>
+              <w:t>；纯静态页面时提交会</w:t>
+            </w:r>
+            <w:r>
+              <w:rPr>
+                <w:rFonts w:ascii="Times New Roman" w:eastAsia="等线" w:hAnsi="Times New Roman" w:cs="Times New Roman" w:hint="eastAsia"/>
+                <w:szCs w:val="21"/>
+              </w:rPr>
+              <w:t xml:space="preserve"> 404 --&gt;</w:t>
+            </w:r>
+          </w:p>
+          <w:p>
+            <w:pPr>
+              <w:spacing w:line="276" w:lineRule="auto"/>
+              <w:ind w:right="1123" w:firstLineChars="200" w:firstLine="420"/>
+              <w:rPr>
+                <w:rFonts w:ascii="Times New Roman" w:eastAsia="等线" w:hAnsi="Times New Roman" w:cs="Times New Roman"/>
+                <w:szCs w:val="21"/>
+              </w:rPr>
+            </w:pPr>
+            <w:r>
+              <w:rPr>
+                <w:rFonts w:ascii="Times New Roman" w:eastAsia="等线" w:hAnsi="Times New Roman" w:cs="Times New Roman" w:hint="eastAsia"/>
+                <w:szCs w:val="21"/>
+              </w:rPr>
+              <w:t xml:space="preserve">    &lt;form action="register" method="post"&gt;</w:t>
+            </w:r>
+          </w:p>
+          <w:p>
+            <w:pPr>
+              <w:spacing w:line="276" w:lineRule="auto"/>
+              <w:ind w:right="1123" w:firstLineChars="200" w:firstLine="420"/>
+              <w:rPr>
+                <w:rFonts w:ascii="Times New Roman" w:eastAsia="等线" w:hAnsi="Times New Roman" w:cs="Times New Roman"/>
+                <w:szCs w:val="21"/>
+              </w:rPr>
+            </w:pPr>
+            <w:r>
+              <w:rPr>
+                <w:rFonts w:ascii="Times New Roman" w:eastAsia="等线" w:hAnsi="Times New Roman" w:cs="Times New Roman" w:hint="eastAsia"/>
+                <w:szCs w:val="21"/>
+              </w:rPr>
+              <w:t xml:space="preserve">        &lt;div class="field"&gt;</w:t>
+            </w:r>
+          </w:p>
+          <w:p>
+            <w:pPr>
+              <w:spacing w:line="276" w:lineRule="auto"/>
+              <w:ind w:right="1123" w:firstLineChars="200" w:firstLine="420"/>
+              <w:rPr>
+                <w:rFonts w:ascii="Times New Roman" w:eastAsia="等线" w:hAnsi="Times New Roman" w:cs="Times New Roman"/>
+                <w:szCs w:val="21"/>
+              </w:rPr>
+            </w:pPr>
+            <w:r>
+              <w:rPr>
+                <w:rFonts w:ascii="Times New Roman" w:eastAsia="等线" w:hAnsi="Times New Roman" w:cs="Times New Roman" w:hint="eastAsia"/>
+                <w:szCs w:val="21"/>
+              </w:rPr>
+              <w:t xml:space="preserve">            &lt;label for="userName"&gt;</w:t>
+            </w:r>
+            <w:r>
+              <w:rPr>
+                <w:rFonts w:ascii="Times New Roman" w:eastAsia="等线" w:hAnsi="Times New Roman" w:cs="Times New Roman" w:hint="eastAsia"/>
+                <w:szCs w:val="21"/>
+              </w:rPr>
+              <w:t>用户名</w:t>
+            </w:r>
+            <w:r>
+              <w:rPr>
+                <w:rFonts w:ascii="Times New Roman" w:eastAsia="等线" w:hAnsi="Times New Roman" w:cs="Times New Roman" w:hint="eastAsia"/>
+                <w:szCs w:val="21"/>
+              </w:rPr>
+              <w:t>&lt;/label&gt;</w:t>
+            </w:r>
+          </w:p>
+          <w:p>
+            <w:pPr>
+              <w:spacing w:line="276" w:lineRule="auto"/>
+              <w:ind w:right="1123" w:firstLineChars="200" w:firstLine="420"/>
+              <w:rPr>
+                <w:rFonts w:ascii="Times New Roman" w:eastAsia="等线" w:hAnsi="Times New Roman" w:cs="Times New Roman"/>
+                <w:szCs w:val="21"/>
+              </w:rPr>
+            </w:pPr>
+            <w:r>
+              <w:rPr>
+                <w:rFonts w:ascii="Times New Roman" w:eastAsia="等线" w:hAnsi="Times New Roman" w:cs="Times New Roman" w:hint="eastAsia"/>
+                <w:szCs w:val="21"/>
+              </w:rPr>
+              <w:t xml:space="preserve">            &lt;input type="text" id="userName" name="userName" placeholder="</w:t>
+            </w:r>
+            <w:r>
+              <w:rPr>
+                <w:rFonts w:ascii="Times New Roman" w:eastAsia="等线" w:hAnsi="Times New Roman" w:cs="Times New Roman" w:hint="eastAsia"/>
+                <w:szCs w:val="21"/>
+              </w:rPr>
+              <w:t>请输入用户名</w:t>
+            </w:r>
+            <w:r>
+              <w:rPr>
+                <w:rFonts w:ascii="Times New Roman" w:eastAsia="等线" w:hAnsi="Times New Roman" w:cs="Times New Roman" w:hint="eastAsia"/>
+                <w:szCs w:val="21"/>
+              </w:rPr>
+              <w:t>"</w:t>
+            </w:r>
+          </w:p>
+          <w:p>
+            <w:pPr>
+              <w:spacing w:line="276" w:lineRule="auto"/>
+              <w:ind w:right="1123" w:firstLineChars="200" w:firstLine="420"/>
+              <w:rPr>
+                <w:rFonts w:ascii="Times New Roman" w:eastAsia="等线" w:hAnsi="Times New Roman" w:cs="Times New Roman"/>
+                <w:szCs w:val="21"/>
+              </w:rPr>
+            </w:pPr>
+            <w:r>
+              <w:rPr>
+                <w:rFonts w:ascii="Times New Roman" w:eastAsia="等线" w:hAnsi="Times New Roman" w:cs="Times New Roman" w:hint="eastAsia"/>
+                <w:szCs w:val="21"/>
+              </w:rPr>
+              <w:t xml:space="preserve">                   autocomplete="username" required&gt;</w:t>
+            </w:r>
+          </w:p>
+          <w:p>
+            <w:pPr>
+              <w:spacing w:line="276" w:lineRule="auto"/>
+              <w:ind w:right="1123" w:firstLineChars="200" w:firstLine="420"/>
+              <w:rPr>
+                <w:rFonts w:ascii="Times New Roman" w:eastAsia="等线" w:hAnsi="Times New Roman" w:cs="Times New Roman"/>
+                <w:szCs w:val="21"/>
+              </w:rPr>
+            </w:pPr>
+            <w:r>
+              <w:rPr>
+                <w:rFonts w:ascii="Times New Roman" w:eastAsia="等线" w:hAnsi="Times New Roman" w:cs="Times New Roman" w:hint="eastAsia"/>
+                <w:szCs w:val="21"/>
+              </w:rPr>
+              <w:t xml:space="preserve">            &lt;p class="hint"&gt;</w:t>
+            </w:r>
+            <w:r>
+              <w:rPr>
+                <w:rFonts w:ascii="Times New Roman" w:eastAsia="等线" w:hAnsi="Times New Roman" w:cs="Times New Roman" w:hint="eastAsia"/>
+                <w:szCs w:val="21"/>
+              </w:rPr>
+              <w:t>建议使用</w:t>
+            </w:r>
+            <w:r>
+              <w:rPr>
+                <w:rFonts w:ascii="Times New Roman" w:eastAsia="等线" w:hAnsi="Times New Roman" w:cs="Times New Roman" w:hint="eastAsia"/>
+                <w:szCs w:val="21"/>
+              </w:rPr>
+              <w:t xml:space="preserve"> 3-16 </w:t>
+            </w:r>
+            <w:r>
+              <w:rPr>
+                <w:rFonts w:ascii="Times New Roman" w:eastAsia="等线" w:hAnsi="Times New Roman" w:cs="Times New Roman" w:hint="eastAsia"/>
+                <w:szCs w:val="21"/>
+              </w:rPr>
+              <w:t>位字母或数字</w:t>
+            </w:r>
+            <w:r>
+              <w:rPr>
+                <w:rFonts w:ascii="Times New Roman" w:eastAsia="等线" w:hAnsi="Times New Roman" w:cs="Times New Roman" w:hint="eastAsia"/>
+                <w:szCs w:val="21"/>
+              </w:rPr>
+              <w:t>&lt;/p&gt;</w:t>
+            </w:r>
+          </w:p>
+          <w:p>
+            <w:pPr>
+              <w:spacing w:line="276" w:lineRule="auto"/>
+              <w:ind w:right="1123" w:firstLineChars="200" w:firstLine="420"/>
+              <w:rPr>
+                <w:rFonts w:ascii="Times New Roman" w:eastAsia="等线" w:hAnsi="Times New Roman" w:cs="Times New Roman"/>
+                <w:szCs w:val="21"/>
+              </w:rPr>
+            </w:pPr>
+            <w:r>
+              <w:rPr>
+                <w:rFonts w:ascii="Times New Roman" w:eastAsia="等线" w:hAnsi="Times New Roman" w:cs="Times New Roman" w:hint="eastAsia"/>
+                <w:szCs w:val="21"/>
+              </w:rPr>
+              <w:t xml:space="preserve">        &lt;/div&gt;</w:t>
+            </w:r>
+          </w:p>
+          <w:p>
+            <w:pPr>
+              <w:spacing w:line="276" w:lineRule="auto"/>
+              <w:ind w:right="1123" w:firstLineChars="200" w:firstLine="420"/>
+              <w:rPr>
+                <w:rFonts w:ascii="Times New Roman" w:eastAsia="等线" w:hAnsi="Times New Roman" w:cs="Times New Roman"/>
+                <w:szCs w:val="21"/>
+              </w:rPr>
+            </w:pPr>
+            <w:r>
+              <w:rPr>
+                <w:rFonts w:ascii="Times New Roman" w:eastAsia="等线" w:hAnsi="Times New Roman" w:cs="Times New Roman" w:hint="eastAsia"/>
+                <w:szCs w:val="21"/>
+              </w:rPr>
+              <w:t xml:space="preserve">        &lt;div class="field"&gt;</w:t>
+            </w:r>
+          </w:p>
+          <w:p>
+            <w:pPr>
+              <w:spacing w:line="276" w:lineRule="auto"/>
+              <w:ind w:right="1123" w:firstLineChars="200" w:firstLine="420"/>
+              <w:rPr>
+                <w:rFonts w:ascii="Times New Roman" w:eastAsia="等线" w:hAnsi="Times New Roman" w:cs="Times New Roman"/>
+                <w:szCs w:val="21"/>
+              </w:rPr>
+            </w:pPr>
+            <w:r>
+              <w:rPr>
+                <w:rFonts w:ascii="Times New Roman" w:eastAsia="等线" w:hAnsi="Times New Roman" w:cs="Times New Roman" w:hint="eastAsia"/>
+                <w:szCs w:val="21"/>
+              </w:rPr>
+              <w:t xml:space="preserve">            &lt;label for="password"&gt;</w:t>
+            </w:r>
+            <w:r>
+              <w:rPr>
+                <w:rFonts w:ascii="Times New Roman" w:eastAsia="等线" w:hAnsi="Times New Roman" w:cs="Times New Roman" w:hint="eastAsia"/>
+                <w:szCs w:val="21"/>
+              </w:rPr>
+              <w:t>密码</w:t>
+            </w:r>
+            <w:r>
+              <w:rPr>
+                <w:rFonts w:ascii="Times New Roman" w:eastAsia="等线" w:hAnsi="Times New Roman" w:cs="Times New Roman" w:hint="eastAsia"/>
+                <w:szCs w:val="21"/>
+              </w:rPr>
+              <w:t>&lt;/label&gt;</w:t>
+            </w:r>
+          </w:p>
+          <w:p>
+            <w:pPr>
+              <w:spacing w:line="276" w:lineRule="auto"/>
+              <w:ind w:right="1123" w:firstLineChars="200" w:firstLine="420"/>
+              <w:rPr>
+                <w:rFonts w:ascii="Times New Roman" w:eastAsia="等线" w:hAnsi="Times New Roman" w:cs="Times New Roman"/>
+                <w:szCs w:val="21"/>
+              </w:rPr>
+            </w:pPr>
+            <w:r>
+              <w:rPr>
+                <w:rFonts w:ascii="Times New Roman" w:eastAsia="等线" w:hAnsi="Times New Roman" w:cs="Times New Roman" w:hint="eastAsia"/>
+                <w:szCs w:val="21"/>
+              </w:rPr>
+              <w:t xml:space="preserve">            &lt;input type="password" id="password" name="password" </w:t>
+            </w:r>
+            <w:r>
+              <w:rPr>
+                <w:rFonts w:ascii="Times New Roman" w:eastAsia="等线" w:hAnsi="Times New Roman" w:cs="Times New Roman" w:hint="eastAsia"/>
+                <w:szCs w:val="21"/>
+              </w:rPr>
+              <w:lastRenderedPageBreak/>
+              <w:t>placeholder="</w:t>
+            </w:r>
+            <w:r>
+              <w:rPr>
+                <w:rFonts w:ascii="Times New Roman" w:eastAsia="等线" w:hAnsi="Times New Roman" w:cs="Times New Roman" w:hint="eastAsia"/>
+                <w:szCs w:val="21"/>
+              </w:rPr>
+              <w:t>请输入密码</w:t>
+            </w:r>
+            <w:r>
+              <w:rPr>
+                <w:rFonts w:ascii="Times New Roman" w:eastAsia="等线" w:hAnsi="Times New Roman" w:cs="Times New Roman" w:hint="eastAsia"/>
+                <w:szCs w:val="21"/>
+              </w:rPr>
+              <w:t>"</w:t>
+            </w:r>
+          </w:p>
+          <w:p>
+            <w:pPr>
+              <w:spacing w:line="276" w:lineRule="auto"/>
+              <w:ind w:right="1123" w:firstLineChars="200" w:firstLine="420"/>
+              <w:rPr>
+                <w:rFonts w:ascii="Times New Roman" w:eastAsia="等线" w:hAnsi="Times New Roman" w:cs="Times New Roman"/>
+                <w:szCs w:val="21"/>
+              </w:rPr>
+            </w:pPr>
+            <w:r>
+              <w:rPr>
+                <w:rFonts w:ascii="Times New Roman" w:eastAsia="等线" w:hAnsi="Times New Roman" w:cs="Times New Roman" w:hint="eastAsia"/>
+                <w:szCs w:val="21"/>
+              </w:rPr>
+              <w:t xml:space="preserve">                   autocomplete="new-password" required&gt;</w:t>
+            </w:r>
+          </w:p>
+          <w:p>
+            <w:pPr>
+              <w:spacing w:line="276" w:lineRule="auto"/>
+              <w:ind w:right="1123" w:firstLineChars="200" w:firstLine="420"/>
+              <w:rPr>
+                <w:rFonts w:ascii="Times New Roman" w:eastAsia="等线" w:hAnsi="Times New Roman" w:cs="Times New Roman"/>
+                <w:szCs w:val="21"/>
+              </w:rPr>
+            </w:pPr>
+            <w:r>
+              <w:rPr>
+                <w:rFonts w:ascii="Times New Roman" w:eastAsia="等线" w:hAnsi="Times New Roman" w:cs="Times New Roman" w:hint="eastAsia"/>
+                <w:szCs w:val="21"/>
+              </w:rPr>
+              <w:t xml:space="preserve">        &lt;/div&gt;</w:t>
+            </w:r>
+          </w:p>
+          <w:p>
+            <w:pPr>
+              <w:spacing w:line="276" w:lineRule="auto"/>
+              <w:ind w:right="1123" w:firstLineChars="200" w:firstLine="420"/>
+              <w:rPr>
+                <w:rFonts w:ascii="Times New Roman" w:eastAsia="等线" w:hAnsi="Times New Roman" w:cs="Times New Roman"/>
+                <w:szCs w:val="21"/>
+              </w:rPr>
+            </w:pPr>
+            <w:r>
+              <w:rPr>
+                <w:rFonts w:ascii="Times New Roman" w:eastAsia="等线" w:hAnsi="Times New Roman" w:cs="Times New Roman" w:hint="eastAsia"/>
+                <w:szCs w:val="21"/>
+              </w:rPr>
+              <w:t xml:space="preserve">        &lt;button type="submit" class="btn"&gt;</w:t>
+            </w:r>
+            <w:r>
+              <w:rPr>
+                <w:rFonts w:ascii="Times New Roman" w:eastAsia="等线" w:hAnsi="Times New Roman" w:cs="Times New Roman" w:hint="eastAsia"/>
+                <w:szCs w:val="21"/>
+              </w:rPr>
+              <w:t>注</w:t>
+            </w:r>
             <w:r>
               <w:rPr>
                 <w:rFonts w:ascii="Times New Roman" w:eastAsia="等线" w:hAnsi="Times New Roman" w:cs="Times New Roman" w:hint="eastAsia"/>
@@ -4199,431 +4235,6 @@
                 <w:rFonts w:ascii="Times New Roman" w:eastAsia="等线" w:hAnsi="Times New Roman" w:cs="Times New Roman" w:hint="eastAsia"/>
                 <w:szCs w:val="21"/>
               </w:rPr>
-              <w:t>注册需要后端</w:t>
-            </w:r>
-            <w:r>
-              <w:rPr>
-                <w:rFonts w:ascii="Times New Roman" w:eastAsia="等线" w:hAnsi="Times New Roman" w:cs="Times New Roman" w:hint="eastAsia"/>
-                <w:szCs w:val="21"/>
-              </w:rPr>
-              <w:t xml:space="preserve"> Servlet </w:t>
-            </w:r>
-            <w:r>
-              <w:rPr>
-                <w:rFonts w:ascii="Times New Roman" w:eastAsia="等线" w:hAnsi="Times New Roman" w:cs="Times New Roman" w:hint="eastAsia"/>
-                <w:szCs w:val="21"/>
-              </w:rPr>
-              <w:t>处理</w:t>
-            </w:r>
-            <w:r>
-              <w:rPr>
-                <w:rFonts w:ascii="Times New Roman" w:eastAsia="等线" w:hAnsi="Times New Roman" w:cs="Times New Roman" w:hint="eastAsia"/>
-                <w:szCs w:val="21"/>
-              </w:rPr>
-              <w:t xml:space="preserve"> /register</w:t>
-            </w:r>
-            <w:r>
-              <w:rPr>
-                <w:rFonts w:ascii="Times New Roman" w:eastAsia="等线" w:hAnsi="Times New Roman" w:cs="Times New Roman" w:hint="eastAsia"/>
-                <w:szCs w:val="21"/>
-              </w:rPr>
-              <w:t>；纯静态页面时提交会</w:t>
-            </w:r>
-            <w:r>
-              <w:rPr>
-                <w:rFonts w:ascii="Times New Roman" w:eastAsia="等线" w:hAnsi="Times New Roman" w:cs="Times New Roman" w:hint="eastAsia"/>
-                <w:szCs w:val="21"/>
-              </w:rPr>
-              <w:t xml:space="preserve"> 404 --&gt;</w:t>
-            </w:r>
-          </w:p>
-          <w:p>
-            <w:pPr>
-              <w:spacing w:line="276" w:lineRule="auto"/>
-              <w:ind w:right="1123" w:firstLineChars="200" w:firstLine="420"/>
-              <w:rPr>
-                <w:rFonts w:ascii="Times New Roman" w:eastAsia="等线" w:hAnsi="Times New Roman" w:cs="Times New Roman"/>
-                <w:szCs w:val="21"/>
-              </w:rPr>
-            </w:pPr>
-            <w:r>
-              <w:rPr>
-                <w:rFonts w:ascii="Times New Roman" w:eastAsia="等线" w:hAnsi="Times New Roman" w:cs="Times New Roman" w:hint="eastAsia"/>
-                <w:szCs w:val="21"/>
-              </w:rPr>
-              <w:t xml:space="preserve">    &lt;form action="register" method="post"&gt;</w:t>
-            </w:r>
-          </w:p>
-          <w:p>
-            <w:pPr>
-              <w:spacing w:line="276" w:lineRule="auto"/>
-              <w:ind w:right="1123" w:firstLineChars="200" w:firstLine="420"/>
-              <w:rPr>
-                <w:rFonts w:ascii="Times New Roman" w:eastAsia="等线" w:hAnsi="Times New Roman" w:cs="Times New Roman"/>
-                <w:szCs w:val="21"/>
-              </w:rPr>
-            </w:pPr>
-            <w:r>
-              <w:rPr>
-                <w:rFonts w:ascii="Times New Roman" w:eastAsia="等线" w:hAnsi="Times New Roman" w:cs="Times New Roman" w:hint="eastAsia"/>
-                <w:szCs w:val="21"/>
-              </w:rPr>
-              <w:t xml:space="preserve">        &lt;div class="field"&gt;</w:t>
-            </w:r>
-          </w:p>
-          <w:p>
-            <w:pPr>
-              <w:spacing w:line="276" w:lineRule="auto"/>
-              <w:ind w:right="1123" w:firstLineChars="200" w:firstLine="420"/>
-              <w:rPr>
-                <w:rFonts w:ascii="Times New Roman" w:eastAsia="等线" w:hAnsi="Times New Roman" w:cs="Times New Roman"/>
-                <w:szCs w:val="21"/>
-              </w:rPr>
-            </w:pPr>
-            <w:r>
-              <w:rPr>
-                <w:rFonts w:ascii="Times New Roman" w:eastAsia="等线" w:hAnsi="Times New Roman" w:cs="Times New Roman" w:hint="eastAsia"/>
-                <w:szCs w:val="21"/>
-              </w:rPr>
-              <w:t xml:space="preserve">            &lt;label for="</w:t>
-            </w:r>
-            <w:proofErr w:type="spellStart"/>
-            <w:r>
-              <w:rPr>
-                <w:rFonts w:ascii="Times New Roman" w:eastAsia="等线" w:hAnsi="Times New Roman" w:cs="Times New Roman" w:hint="eastAsia"/>
-                <w:szCs w:val="21"/>
-              </w:rPr>
-              <w:t>userName</w:t>
-            </w:r>
-            <w:proofErr w:type="spellEnd"/>
-            <w:r>
-              <w:rPr>
-                <w:rFonts w:ascii="Times New Roman" w:eastAsia="等线" w:hAnsi="Times New Roman" w:cs="Times New Roman" w:hint="eastAsia"/>
-                <w:szCs w:val="21"/>
-              </w:rPr>
-              <w:t>"&gt;</w:t>
-            </w:r>
-            <w:r>
-              <w:rPr>
-                <w:rFonts w:ascii="Times New Roman" w:eastAsia="等线" w:hAnsi="Times New Roman" w:cs="Times New Roman" w:hint="eastAsia"/>
-                <w:szCs w:val="21"/>
-              </w:rPr>
-              <w:t>用户名</w:t>
-            </w:r>
-            <w:r>
-              <w:rPr>
-                <w:rFonts w:ascii="Times New Roman" w:eastAsia="等线" w:hAnsi="Times New Roman" w:cs="Times New Roman" w:hint="eastAsia"/>
-                <w:szCs w:val="21"/>
-              </w:rPr>
-              <w:t>&lt;/label&gt;</w:t>
-            </w:r>
-          </w:p>
-          <w:p>
-            <w:pPr>
-              <w:spacing w:line="276" w:lineRule="auto"/>
-              <w:ind w:right="1123" w:firstLineChars="200" w:firstLine="420"/>
-              <w:rPr>
-                <w:rFonts w:ascii="Times New Roman" w:eastAsia="等线" w:hAnsi="Times New Roman" w:cs="Times New Roman"/>
-                <w:szCs w:val="21"/>
-              </w:rPr>
-            </w:pPr>
-            <w:r>
-              <w:rPr>
-                <w:rFonts w:ascii="Times New Roman" w:eastAsia="等线" w:hAnsi="Times New Roman" w:cs="Times New Roman" w:hint="eastAsia"/>
-                <w:szCs w:val="21"/>
-              </w:rPr>
-              <w:t xml:space="preserve">            &lt;input type="text" id="</w:t>
-            </w:r>
-            <w:proofErr w:type="spellStart"/>
-            <w:r>
-              <w:rPr>
-                <w:rFonts w:ascii="Times New Roman" w:eastAsia="等线" w:hAnsi="Times New Roman" w:cs="Times New Roman" w:hint="eastAsia"/>
-                <w:szCs w:val="21"/>
-              </w:rPr>
-              <w:t>userName</w:t>
-            </w:r>
-            <w:proofErr w:type="spellEnd"/>
-            <w:r>
-              <w:rPr>
-                <w:rFonts w:ascii="Times New Roman" w:eastAsia="等线" w:hAnsi="Times New Roman" w:cs="Times New Roman" w:hint="eastAsia"/>
-                <w:szCs w:val="21"/>
-              </w:rPr>
-              <w:t>" name="</w:t>
-            </w:r>
-            <w:proofErr w:type="spellStart"/>
-            <w:r>
-              <w:rPr>
-                <w:rFonts w:ascii="Times New Roman" w:eastAsia="等线" w:hAnsi="Times New Roman" w:cs="Times New Roman" w:hint="eastAsia"/>
-                <w:szCs w:val="21"/>
-              </w:rPr>
-              <w:t>userName</w:t>
-            </w:r>
-            <w:proofErr w:type="spellEnd"/>
-            <w:r>
-              <w:rPr>
-                <w:rFonts w:ascii="Times New Roman" w:eastAsia="等线" w:hAnsi="Times New Roman" w:cs="Times New Roman" w:hint="eastAsia"/>
-                <w:szCs w:val="21"/>
-              </w:rPr>
-              <w:t>" placeholder="</w:t>
-            </w:r>
-            <w:r>
-              <w:rPr>
-                <w:rFonts w:ascii="Times New Roman" w:eastAsia="等线" w:hAnsi="Times New Roman" w:cs="Times New Roman" w:hint="eastAsia"/>
-                <w:szCs w:val="21"/>
-              </w:rPr>
-              <w:t>请输入用户名</w:t>
-            </w:r>
-            <w:r>
-              <w:rPr>
-                <w:rFonts w:ascii="Times New Roman" w:eastAsia="等线" w:hAnsi="Times New Roman" w:cs="Times New Roman" w:hint="eastAsia"/>
-                <w:szCs w:val="21"/>
-              </w:rPr>
-              <w:t>"</w:t>
-            </w:r>
-          </w:p>
-          <w:p>
-            <w:pPr>
-              <w:spacing w:line="276" w:lineRule="auto"/>
-              <w:ind w:right="1123" w:firstLineChars="200" w:firstLine="420"/>
-              <w:rPr>
-                <w:rFonts w:ascii="Times New Roman" w:eastAsia="等线" w:hAnsi="Times New Roman" w:cs="Times New Roman"/>
-                <w:szCs w:val="21"/>
-              </w:rPr>
-            </w:pPr>
-            <w:r>
-              <w:rPr>
-                <w:rFonts w:ascii="Times New Roman" w:eastAsia="等线" w:hAnsi="Times New Roman" w:cs="Times New Roman" w:hint="eastAsia"/>
-                <w:szCs w:val="21"/>
-              </w:rPr>
-              <w:t xml:space="preserve">                   autocomplete="username" required&gt;</w:t>
-            </w:r>
-          </w:p>
-          <w:p>
-            <w:pPr>
-              <w:spacing w:line="276" w:lineRule="auto"/>
-              <w:ind w:right="1123" w:firstLineChars="200" w:firstLine="420"/>
-              <w:rPr>
-                <w:rFonts w:ascii="Times New Roman" w:eastAsia="等线" w:hAnsi="Times New Roman" w:cs="Times New Roman"/>
-                <w:szCs w:val="21"/>
-              </w:rPr>
-            </w:pPr>
-            <w:r>
-              <w:rPr>
-                <w:rFonts w:ascii="Times New Roman" w:eastAsia="等线" w:hAnsi="Times New Roman" w:cs="Times New Roman" w:hint="eastAsia"/>
-                <w:szCs w:val="21"/>
-              </w:rPr>
-              <w:t xml:space="preserve">            &lt;p class="hint"&gt;</w:t>
-            </w:r>
-            <w:r>
-              <w:rPr>
-                <w:rFonts w:ascii="Times New Roman" w:eastAsia="等线" w:hAnsi="Times New Roman" w:cs="Times New Roman" w:hint="eastAsia"/>
-                <w:szCs w:val="21"/>
-              </w:rPr>
-              <w:t>建议使用</w:t>
-            </w:r>
-            <w:r>
-              <w:rPr>
-                <w:rFonts w:ascii="Times New Roman" w:eastAsia="等线" w:hAnsi="Times New Roman" w:cs="Times New Roman" w:hint="eastAsia"/>
-                <w:szCs w:val="21"/>
-              </w:rPr>
-              <w:t xml:space="preserve"> 3-16 </w:t>
-            </w:r>
-            <w:r>
-              <w:rPr>
-                <w:rFonts w:ascii="Times New Roman" w:eastAsia="等线" w:hAnsi="Times New Roman" w:cs="Times New Roman" w:hint="eastAsia"/>
-                <w:szCs w:val="21"/>
-              </w:rPr>
-              <w:t>位字母或数字</w:t>
-            </w:r>
-            <w:r>
-              <w:rPr>
-                <w:rFonts w:ascii="Times New Roman" w:eastAsia="等线" w:hAnsi="Times New Roman" w:cs="Times New Roman" w:hint="eastAsia"/>
-                <w:szCs w:val="21"/>
-              </w:rPr>
-              <w:t>&lt;/p&gt;</w:t>
-            </w:r>
-          </w:p>
-          <w:p>
-            <w:pPr>
-              <w:spacing w:line="276" w:lineRule="auto"/>
-              <w:ind w:right="1123" w:firstLineChars="200" w:firstLine="420"/>
-              <w:rPr>
-                <w:rFonts w:ascii="Times New Roman" w:eastAsia="等线" w:hAnsi="Times New Roman" w:cs="Times New Roman"/>
-                <w:szCs w:val="21"/>
-              </w:rPr>
-            </w:pPr>
-            <w:r>
-              <w:rPr>
-                <w:rFonts w:ascii="Times New Roman" w:eastAsia="等线" w:hAnsi="Times New Roman" w:cs="Times New Roman" w:hint="eastAsia"/>
-                <w:szCs w:val="21"/>
-              </w:rPr>
-              <w:t xml:space="preserve">        &lt;/div&gt;</w:t>
-            </w:r>
-          </w:p>
-          <w:p>
-            <w:pPr>
-              <w:spacing w:line="276" w:lineRule="auto"/>
-              <w:ind w:right="1123" w:firstLineChars="200" w:firstLine="420"/>
-              <w:rPr>
-                <w:rFonts w:ascii="Times New Roman" w:eastAsia="等线" w:hAnsi="Times New Roman" w:cs="Times New Roman"/>
-                <w:szCs w:val="21"/>
-              </w:rPr>
-            </w:pPr>
-            <w:r>
-              <w:rPr>
-                <w:rFonts w:ascii="Times New Roman" w:eastAsia="等线" w:hAnsi="Times New Roman" w:cs="Times New Roman" w:hint="eastAsia"/>
-                <w:szCs w:val="21"/>
-              </w:rPr>
-              <w:t xml:space="preserve">        &lt;div class="field"&gt;</w:t>
-            </w:r>
-          </w:p>
-          <w:p>
-            <w:pPr>
-              <w:spacing w:line="276" w:lineRule="auto"/>
-              <w:ind w:right="1123" w:firstLineChars="200" w:firstLine="420"/>
-              <w:rPr>
-                <w:rFonts w:ascii="Times New Roman" w:eastAsia="等线" w:hAnsi="Times New Roman" w:cs="Times New Roman"/>
-                <w:szCs w:val="21"/>
-              </w:rPr>
-            </w:pPr>
-            <w:r>
-              <w:rPr>
-                <w:rFonts w:ascii="Times New Roman" w:eastAsia="等线" w:hAnsi="Times New Roman" w:cs="Times New Roman" w:hint="eastAsia"/>
-                <w:szCs w:val="21"/>
-              </w:rPr>
-              <w:t xml:space="preserve">            &lt;label for="password"&gt;</w:t>
-            </w:r>
-            <w:r>
-              <w:rPr>
-                <w:rFonts w:ascii="Times New Roman" w:eastAsia="等线" w:hAnsi="Times New Roman" w:cs="Times New Roman" w:hint="eastAsia"/>
-                <w:szCs w:val="21"/>
-              </w:rPr>
-              <w:t>密码</w:t>
-            </w:r>
-            <w:r>
-              <w:rPr>
-                <w:rFonts w:ascii="Times New Roman" w:eastAsia="等线" w:hAnsi="Times New Roman" w:cs="Times New Roman" w:hint="eastAsia"/>
-                <w:szCs w:val="21"/>
-              </w:rPr>
-              <w:t>&lt;/label&gt;</w:t>
-            </w:r>
-          </w:p>
-          <w:p>
-            <w:pPr>
-              <w:spacing w:line="276" w:lineRule="auto"/>
-              <w:ind w:right="1123" w:firstLineChars="200" w:firstLine="420"/>
-              <w:rPr>
-                <w:rFonts w:ascii="Times New Roman" w:eastAsia="等线" w:hAnsi="Times New Roman" w:cs="Times New Roman"/>
-                <w:szCs w:val="21"/>
-              </w:rPr>
-            </w:pPr>
-            <w:r>
-              <w:rPr>
-                <w:rFonts w:ascii="Times New Roman" w:eastAsia="等线" w:hAnsi="Times New Roman" w:cs="Times New Roman" w:hint="eastAsia"/>
-                <w:szCs w:val="21"/>
-              </w:rPr>
-              <w:t xml:space="preserve">            &lt;input type="password" id="password" name="password" placeholder="</w:t>
-            </w:r>
-            <w:r>
-              <w:rPr>
-                <w:rFonts w:ascii="Times New Roman" w:eastAsia="等线" w:hAnsi="Times New Roman" w:cs="Times New Roman" w:hint="eastAsia"/>
-                <w:szCs w:val="21"/>
-              </w:rPr>
-              <w:t>请输入密码</w:t>
-            </w:r>
-            <w:r>
-              <w:rPr>
-                <w:rFonts w:ascii="Times New Roman" w:eastAsia="等线" w:hAnsi="Times New Roman" w:cs="Times New Roman" w:hint="eastAsia"/>
-                <w:szCs w:val="21"/>
-              </w:rPr>
-              <w:t>"</w:t>
-            </w:r>
-          </w:p>
-          <w:p>
-            <w:pPr>
-              <w:spacing w:line="276" w:lineRule="auto"/>
-              <w:ind w:right="1123" w:firstLineChars="200" w:firstLine="420"/>
-              <w:rPr>
-                <w:rFonts w:ascii="Times New Roman" w:eastAsia="等线" w:hAnsi="Times New Roman" w:cs="Times New Roman"/>
-                <w:szCs w:val="21"/>
-              </w:rPr>
-            </w:pPr>
-            <w:r>
-              <w:rPr>
-                <w:rFonts w:ascii="Times New Roman" w:eastAsia="等线" w:hAnsi="Times New Roman" w:cs="Times New Roman" w:hint="eastAsia"/>
-                <w:szCs w:val="21"/>
-              </w:rPr>
-              <w:t xml:space="preserve">                   autocomplete="new-password" required&gt;</w:t>
-            </w:r>
-          </w:p>
-          <w:p>
-            <w:pPr>
-              <w:spacing w:line="276" w:lineRule="auto"/>
-              <w:ind w:right="1123" w:firstLineChars="200" w:firstLine="420"/>
-              <w:rPr>
-                <w:rFonts w:ascii="Times New Roman" w:eastAsia="等线" w:hAnsi="Times New Roman" w:cs="Times New Roman"/>
-                <w:szCs w:val="21"/>
-              </w:rPr>
-            </w:pPr>
-            <w:r>
-              <w:rPr>
-                <w:rFonts w:ascii="Times New Roman" w:eastAsia="等线" w:hAnsi="Times New Roman" w:cs="Times New Roman" w:hint="eastAsia"/>
-                <w:szCs w:val="21"/>
-              </w:rPr>
-              <w:t xml:space="preserve">        &lt;/div&gt;</w:t>
-            </w:r>
-          </w:p>
-          <w:p>
-            <w:pPr>
-              <w:spacing w:line="276" w:lineRule="auto"/>
-              <w:ind w:right="1123" w:firstLineChars="200" w:firstLine="420"/>
-              <w:rPr>
-                <w:rFonts w:ascii="Times New Roman" w:eastAsia="等线" w:hAnsi="Times New Roman" w:cs="Times New Roman"/>
-                <w:szCs w:val="21"/>
-              </w:rPr>
-            </w:pPr>
-            <w:r>
-              <w:rPr>
-                <w:rFonts w:ascii="Times New Roman" w:eastAsia="等线" w:hAnsi="Times New Roman" w:cs="Times New Roman" w:hint="eastAsia"/>
-                <w:szCs w:val="21"/>
-              </w:rPr>
-              <w:t xml:space="preserve">        &lt;button type="submit" class="</w:t>
-            </w:r>
-            <w:proofErr w:type="spellStart"/>
-            <w:r>
-              <w:rPr>
-                <w:rFonts w:ascii="Times New Roman" w:eastAsia="等线" w:hAnsi="Times New Roman" w:cs="Times New Roman" w:hint="eastAsia"/>
-                <w:szCs w:val="21"/>
-              </w:rPr>
-              <w:t>btn</w:t>
-            </w:r>
-            <w:proofErr w:type="spellEnd"/>
-            <w:r>
-              <w:rPr>
-                <w:rFonts w:ascii="Times New Roman" w:eastAsia="等线" w:hAnsi="Times New Roman" w:cs="Times New Roman" w:hint="eastAsia"/>
-                <w:szCs w:val="21"/>
-              </w:rPr>
-              <w:t>"&gt;</w:t>
-            </w:r>
-            <w:r>
-              <w:rPr>
-                <w:rFonts w:ascii="Times New Roman" w:eastAsia="等线" w:hAnsi="Times New Roman" w:cs="Times New Roman" w:hint="eastAsia"/>
-                <w:szCs w:val="21"/>
-              </w:rPr>
-              <w:t>注</w:t>
-            </w:r>
-            <w:r>
-              <w:rPr>
-                <w:rFonts w:ascii="Times New Roman" w:eastAsia="等线" w:hAnsi="Times New Roman" w:cs="Times New Roman" w:hint="eastAsia"/>
-                <w:szCs w:val="21"/>
-              </w:rPr>
-              <w:t xml:space="preserve"> </w:t>
-            </w:r>
-            <w:r>
-              <w:rPr>
-                <w:rFonts w:ascii="Times New Roman" w:eastAsia="等线" w:hAnsi="Times New Roman" w:cs="Times New Roman" w:hint="eastAsia"/>
-                <w:szCs w:val="21"/>
-              </w:rPr>
               <w:t>册</w:t>
             </w:r>
             <w:r>
@@ -4689,23 +4300,7 @@
                 <w:rFonts w:ascii="Times New Roman" w:eastAsia="等线" w:hAnsi="Times New Roman" w:cs="Times New Roman" w:hint="eastAsia"/>
                 <w:szCs w:val="21"/>
               </w:rPr>
-              <w:t xml:space="preserve">&lt;a </w:t>
-            </w:r>
-            <w:proofErr w:type="spellStart"/>
-            <w:r>
-              <w:rPr>
-                <w:rFonts w:ascii="Times New Roman" w:eastAsia="等线" w:hAnsi="Times New Roman" w:cs="Times New Roman" w:hint="eastAsia"/>
-                <w:szCs w:val="21"/>
-              </w:rPr>
-              <w:t>href</w:t>
-            </w:r>
-            <w:proofErr w:type="spellEnd"/>
-            <w:r>
-              <w:rPr>
-                <w:rFonts w:ascii="Times New Roman" w:eastAsia="等线" w:hAnsi="Times New Roman" w:cs="Times New Roman" w:hint="eastAsia"/>
-                <w:szCs w:val="21"/>
-              </w:rPr>
-              <w:t>="login.html"&gt;</w:t>
+              <w:t>&lt;a href="login.html"&gt;</w:t>
             </w:r>
             <w:r>
               <w:rPr>
@@ -4817,23 +4412,7 @@
                 <w:rFonts w:ascii="Times New Roman" w:eastAsia="等线" w:hAnsi="Times New Roman" w:cs="Times New Roman" w:hint="eastAsia"/>
                 <w:szCs w:val="21"/>
               </w:rPr>
-              <w:t>要求：截</w:t>
-            </w:r>
-            <w:proofErr w:type="gramStart"/>
-            <w:r>
-              <w:rPr>
-                <w:rFonts w:ascii="Times New Roman" w:eastAsia="等线" w:hAnsi="Times New Roman" w:cs="Times New Roman" w:hint="eastAsia"/>
-                <w:szCs w:val="21"/>
-              </w:rPr>
-              <w:t>图记录</w:t>
-            </w:r>
-            <w:proofErr w:type="gramEnd"/>
-            <w:r>
-              <w:rPr>
-                <w:rFonts w:ascii="Times New Roman" w:eastAsia="等线" w:hAnsi="Times New Roman" w:cs="Times New Roman" w:hint="eastAsia"/>
-                <w:szCs w:val="21"/>
-              </w:rPr>
-              <w:t>在浏览器访问效果</w:t>
+              <w:t>要求：截图记录在浏览器访问效果</w:t>
             </w:r>
           </w:p>
           <w:p>
@@ -4934,7 +4513,6 @@
                 <w:noProof/>
                 <w:szCs w:val="21"/>
               </w:rPr>
-              <w:lastRenderedPageBreak/>
               <w:drawing>
                 <wp:inline distT="0" distB="0" distL="0" distR="0" wp14:anchorId="49002E9B" wp14:editId="2708DE3B">
                   <wp:extent cx="5278120" cy="2324735"/>
@@ -5013,6 +4591,7 @@
                 <w:rFonts w:ascii="Times New Roman" w:eastAsia="等线" w:hAnsi="Times New Roman" w:cs="Times New Roman" w:hint="eastAsia"/>
                 <w:szCs w:val="21"/>
               </w:rPr>
+              <w:lastRenderedPageBreak/>
               <w:t>答：</w:t>
             </w:r>
             <w:r>
@@ -5159,7 +4738,6 @@
                 <w:rFonts w:ascii="Times New Roman" w:eastAsia="等线" w:hAnsi="Times New Roman" w:cs="Times New Roman"/>
                 <w:szCs w:val="21"/>
               </w:rPr>
-              <w:lastRenderedPageBreak/>
               <w:t>六、实验总结</w:t>
             </w:r>
           </w:p>
@@ -5234,7 +4812,6 @@
               </w:rPr>
               <w:t>通过本次</w:t>
             </w:r>
-            <w:proofErr w:type="spellStart"/>
             <w:r>
               <w:rPr>
                 <w:rFonts w:ascii="Times New Roman" w:eastAsia="等线" w:hAnsi="Times New Roman" w:cs="Times New Roman" w:hint="eastAsia"/>
@@ -5242,7 +4819,6 @@
               </w:rPr>
               <w:t>JavaWeb</w:t>
             </w:r>
-            <w:proofErr w:type="spellEnd"/>
             <w:r>
               <w:rPr>
                 <w:rFonts w:ascii="Times New Roman" w:eastAsia="等线" w:hAnsi="Times New Roman" w:cs="Times New Roman" w:hint="eastAsia"/>
@@ -5675,23 +5251,7 @@
                 <w:rFonts w:ascii="Times New Roman" w:eastAsia="等线" w:hAnsi="Times New Roman" w:cs="Times New Roman" w:hint="eastAsia"/>
                 <w:szCs w:val="21"/>
               </w:rPr>
-              <w:t>属性在数据</w:t>
-            </w:r>
-            <w:proofErr w:type="gramStart"/>
-            <w:r>
-              <w:rPr>
-                <w:rFonts w:ascii="Times New Roman" w:eastAsia="等线" w:hAnsi="Times New Roman" w:cs="Times New Roman" w:hint="eastAsia"/>
-                <w:szCs w:val="21"/>
-              </w:rPr>
-              <w:t>交互中</w:t>
-            </w:r>
-            <w:proofErr w:type="gramEnd"/>
-            <w:r>
-              <w:rPr>
-                <w:rFonts w:ascii="Times New Roman" w:eastAsia="等线" w:hAnsi="Times New Roman" w:cs="Times New Roman" w:hint="eastAsia"/>
-                <w:szCs w:val="21"/>
-              </w:rPr>
-              <w:t>的作用。</w:t>
+              <w:t>属性在数据交互中的作用。</w:t>
             </w:r>
           </w:p>
           <w:p>
@@ -5816,7 +5376,6 @@
               </w:rPr>
               <w:t>本次实验是</w:t>
             </w:r>
-            <w:proofErr w:type="spellStart"/>
             <w:r>
               <w:rPr>
                 <w:rFonts w:ascii="Times New Roman" w:eastAsia="等线" w:hAnsi="Times New Roman" w:cs="Times New Roman" w:hint="eastAsia"/>
@@ -5824,7 +5383,6 @@
               </w:rPr>
               <w:t>JavaWeb</w:t>
             </w:r>
-            <w:proofErr w:type="spellEnd"/>
             <w:r>
               <w:rPr>
                 <w:rFonts w:ascii="Times New Roman" w:eastAsia="等线" w:hAnsi="Times New Roman" w:cs="Times New Roman" w:hint="eastAsia"/>
@@ -5844,23 +5402,7 @@
                 <w:rFonts w:ascii="Times New Roman" w:eastAsia="等线" w:hAnsi="Times New Roman" w:cs="Times New Roman" w:hint="eastAsia"/>
                 <w:szCs w:val="21"/>
               </w:rPr>
-              <w:t>项目从开发</w:t>
-            </w:r>
-            <w:proofErr w:type="gramStart"/>
-            <w:r>
-              <w:rPr>
-                <w:rFonts w:ascii="Times New Roman" w:eastAsia="等线" w:hAnsi="Times New Roman" w:cs="Times New Roman" w:hint="eastAsia"/>
-                <w:szCs w:val="21"/>
-              </w:rPr>
-              <w:t>到部署</w:t>
-            </w:r>
-            <w:proofErr w:type="gramEnd"/>
-            <w:r>
-              <w:rPr>
-                <w:rFonts w:ascii="Times New Roman" w:eastAsia="等线" w:hAnsi="Times New Roman" w:cs="Times New Roman" w:hint="eastAsia"/>
-                <w:szCs w:val="21"/>
-              </w:rPr>
-              <w:t>的完整闭环。通过亲手启动</w:t>
+              <w:t>项目从开发到部署的完整闭环。通过亲手启动</w:t>
             </w:r>
             <w:r>
               <w:rPr>
@@ -5975,7 +5517,7 @@
       </w:tr>
       <w:tr>
         <w:trPr>
-          <w:trHeight w:val="3934"/>
+          <w:trHeight w:val="7763"/>
         </w:trPr>
         <w:tc>
           <w:tcPr>
@@ -5993,7 +5535,7 @@
               <w:spacing w:line="276" w:lineRule="auto"/>
               <w:ind w:right="1124"/>
               <w:rPr>
-                <w:rFonts w:ascii="Times New Roman" w:eastAsia="等线" w:hAnsi="Times New Roman" w:cs="Times New Roman" w:hint="eastAsia"/>
+                <w:rFonts w:ascii="Times New Roman" w:eastAsia="等线" w:hAnsi="Times New Roman" w:cs="Times New Roman"/>
                 <w:szCs w:val="21"/>
               </w:rPr>
             </w:pPr>
@@ -6014,7 +5556,12 @@
       </w:pPr>
     </w:p>
     <w:sectPr>
-      <w:footerReference w:type="default" r:id="rId24"/>
+      <w:headerReference w:type="even" r:id="rId24"/>
+      <w:headerReference w:type="default" r:id="rId25"/>
+      <w:footerReference w:type="even" r:id="rId26"/>
+      <w:footerReference w:type="default" r:id="rId27"/>
+      <w:headerReference w:type="first" r:id="rId28"/>
+      <w:footerReference w:type="first" r:id="rId29"/>
       <w:pgSz w:w="11906" w:h="16838" w:code="9"/>
       <w:pgMar w:top="1440" w:right="1797" w:bottom="1440" w:left="1797" w:header="851" w:footer="992" w:gutter="0"/>
       <w:cols w:space="425"/>
@@ -6059,6 +5606,19 @@
     <w:pPr>
       <w:pStyle w:val="a5"/>
       <w:rPr>
+        <w:rFonts w:hint="eastAsia"/>
+      </w:rPr>
+    </w:pPr>
+  </w:p>
+</w:ftr>
+</file>
+
+<file path=word/footer2.xml><?xml version="1.0" encoding="utf-8"?>
+<w:ftr xmlns:wpc="http://schemas.microsoft.com/office/word/2010/wordprocessingCanvas" xmlns:cx="http://schemas.microsoft.com/office/drawing/2014/chartex" xmlns:cx1="http://schemas.microsoft.com/office/drawing/2015/9/8/chartex" xmlns:cx2="http://schemas.microsoft.com/office/drawing/2015/10/21/chartex" xmlns:cx3="http://schemas.microsoft.com/office/drawing/2016/5/9/chartex" xmlns:cx4="http://schemas.microsoft.com/office/drawing/2016/5/10/chartex" xmlns:cx5="http://schemas.microsoft.com/office/drawing/2016/5/11/chartex" xmlns:cx6="http://schemas.microsoft.com/office/drawing/2016/5/12/chartex" xmlns:cx7="http://schemas.microsoft.com/office/drawing/2016/5/13/chartex" xmlns:cx8="http://schemas.microsoft.com/office/drawing/2016/5/14/chartex" xmlns:mc="http://schemas.openxmlformats.org/markup-compatibility/2006" xmlns:aink="http://schemas.microsoft.com/office/drawing/2016/ink" xmlns:am3d="http://schemas.microsoft.com/office/drawing/2017/model3d" xmlns:o="urn:schemas-microsoft-com:office:office" xmlns:oel="http://schemas.microsoft.com/office/2019/extlst" xmlns:r="http://schemas.openxmlformats.org/officeDocument/2006/relationships" xmlns:m="http://schemas.openxmlformats.org/officeDocument/2006/math" xmlns:v="urn:schemas-microsoft-com:vml" xmlns:wp14="http://schemas.microsoft.com/office/word/2010/wordprocessingDrawing" xmlns:wp="http://schemas.openxmlformats.org/drawingml/2006/wordprocessingDrawing" xmlns:w10="urn:schemas-microsoft-com:office:word" xmlns:w="http://schemas.openxmlformats.org/wordprocessingml/2006/main" xmlns:w14="http://schemas.microsoft.com/office/word/2010/wordml" xmlns:w15="http://schemas.microsoft.com/office/word/2012/wordml" xmlns:w16cex="http://schemas.microsoft.com/office/word/2018/wordml/cex" xmlns:w16cid="http://schemas.microsoft.com/office/word/2016/wordml/cid" xmlns:w16="http://schemas.microsoft.com/office/word/2018/wordml" xmlns:w16sdtdh="http://schemas.microsoft.com/office/word/2020/wordml/sdtdatahash" xmlns:w16se="http://schemas.microsoft.com/office/word/2015/wordml/symex" xmlns:wpg="http://schemas.microsoft.com/office/word/2010/wordprocessingGroup" xmlns:wpi="http://schemas.microsoft.com/office/word/2010/wordprocessingInk" xmlns:wne="http://schemas.microsoft.com/office/word/2006/wordml" xmlns:wps="http://schemas.microsoft.com/office/word/2010/wordprocessingShape" mc:Ignorable="w14 w15 w16se w16cid w16 w16cex w16sdtdh wp14">
+  <w:p>
+    <w:pPr>
+      <w:pStyle w:val="a5"/>
+      <w:rPr>
         <w:rFonts w:ascii="宋体" w:eastAsia="宋体" w:hAnsi="宋体" w:hint="eastAsia"/>
         <w:b/>
         <w:sz w:val="28"/>
@@ -6092,7 +5652,7 @@
         <w:szCs w:val="28"/>
         <w:u w:val="single"/>
       </w:rPr>
-      <w:t>11</w:t>
+      <w:t>12</w:t>
     </w:r>
     <w:r>
       <w:rPr>
@@ -6172,6 +5732,19 @@
 </w:ftr>
 </file>
 
+<file path=word/footer3.xml><?xml version="1.0" encoding="utf-8"?>
+<w:ftr xmlns:wpc="http://schemas.microsoft.com/office/word/2010/wordprocessingCanvas" xmlns:cx="http://schemas.microsoft.com/office/drawing/2014/chartex" xmlns:cx1="http://schemas.microsoft.com/office/drawing/2015/9/8/chartex" xmlns:cx2="http://schemas.microsoft.com/office/drawing/2015/10/21/chartex" xmlns:cx3="http://schemas.microsoft.com/office/drawing/2016/5/9/chartex" xmlns:cx4="http://schemas.microsoft.com/office/drawing/2016/5/10/chartex" xmlns:cx5="http://schemas.microsoft.com/office/drawing/2016/5/11/chartex" xmlns:cx6="http://schemas.microsoft.com/office/drawing/2016/5/12/chartex" xmlns:cx7="http://schemas.microsoft.com/office/drawing/2016/5/13/chartex" xmlns:cx8="http://schemas.microsoft.com/office/drawing/2016/5/14/chartex" xmlns:mc="http://schemas.openxmlformats.org/markup-compatibility/2006" xmlns:aink="http://schemas.microsoft.com/office/drawing/2016/ink" xmlns:am3d="http://schemas.microsoft.com/office/drawing/2017/model3d" xmlns:o="urn:schemas-microsoft-com:office:office" xmlns:oel="http://schemas.microsoft.com/office/2019/extlst" xmlns:r="http://schemas.openxmlformats.org/officeDocument/2006/relationships" xmlns:m="http://schemas.openxmlformats.org/officeDocument/2006/math" xmlns:v="urn:schemas-microsoft-com:vml" xmlns:wp14="http://schemas.microsoft.com/office/word/2010/wordprocessingDrawing" xmlns:wp="http://schemas.openxmlformats.org/drawingml/2006/wordprocessingDrawing" xmlns:w10="urn:schemas-microsoft-com:office:word" xmlns:w="http://schemas.openxmlformats.org/wordprocessingml/2006/main" xmlns:w14="http://schemas.microsoft.com/office/word/2010/wordml" xmlns:w15="http://schemas.microsoft.com/office/word/2012/wordml" xmlns:w16cex="http://schemas.microsoft.com/office/word/2018/wordml/cex" xmlns:w16cid="http://schemas.microsoft.com/office/word/2016/wordml/cid" xmlns:w16="http://schemas.microsoft.com/office/word/2018/wordml" xmlns:w16sdtdh="http://schemas.microsoft.com/office/word/2020/wordml/sdtdatahash" xmlns:w16se="http://schemas.microsoft.com/office/word/2015/wordml/symex" xmlns:wpg="http://schemas.microsoft.com/office/word/2010/wordprocessingGroup" xmlns:wpi="http://schemas.microsoft.com/office/word/2010/wordprocessingInk" xmlns:wne="http://schemas.microsoft.com/office/word/2006/wordml" xmlns:wps="http://schemas.microsoft.com/office/word/2010/wordprocessingShape" mc:Ignorable="w14 w15 w16se w16cid w16 w16cex w16sdtdh wp14">
+  <w:p>
+    <w:pPr>
+      <w:pStyle w:val="a5"/>
+      <w:rPr>
+        <w:rFonts w:hint="eastAsia"/>
+      </w:rPr>
+    </w:pPr>
+  </w:p>
+</w:ftr>
+</file>
+
 <file path=word/footnotes.xml><?xml version="1.0" encoding="utf-8"?>
 <w:footnotes xmlns:wpc="http://schemas.microsoft.com/office/word/2010/wordprocessingCanvas" xmlns:cx="http://schemas.microsoft.com/office/drawing/2014/chartex" xmlns:cx1="http://schemas.microsoft.com/office/drawing/2015/9/8/chartex" xmlns:cx2="http://schemas.microsoft.com/office/drawing/2015/10/21/chartex" xmlns:cx3="http://schemas.microsoft.com/office/drawing/2016/5/9/chartex" xmlns:cx4="http://schemas.microsoft.com/office/drawing/2016/5/10/chartex" xmlns:cx5="http://schemas.microsoft.com/office/drawing/2016/5/11/chartex" xmlns:cx6="http://schemas.microsoft.com/office/drawing/2016/5/12/chartex" xmlns:cx7="http://schemas.microsoft.com/office/drawing/2016/5/13/chartex" xmlns:cx8="http://schemas.microsoft.com/office/drawing/2016/5/14/chartex" xmlns:mc="http://schemas.openxmlformats.org/markup-compatibility/2006" xmlns:aink="http://schemas.microsoft.com/office/drawing/2016/ink" xmlns:am3d="http://schemas.microsoft.com/office/drawing/2017/model3d" xmlns:o="urn:schemas-microsoft-com:office:office" xmlns:oel="http://schemas.microsoft.com/office/2019/extlst" xmlns:r="http://schemas.openxmlformats.org/officeDocument/2006/relationships" xmlns:m="http://schemas.openxmlformats.org/officeDocument/2006/math" xmlns:v="urn:schemas-microsoft-com:vml" xmlns:wp14="http://schemas.microsoft.com/office/word/2010/wordprocessingDrawing" xmlns:wp="http://schemas.openxmlformats.org/drawingml/2006/wordprocessingDrawing" xmlns:w10="urn:schemas-microsoft-com:office:word" xmlns:w="http://schemas.openxmlformats.org/wordprocessingml/2006/main" xmlns:w14="http://schemas.microsoft.com/office/word/2010/wordml" xmlns:w15="http://schemas.microsoft.com/office/word/2012/wordml" xmlns:w16cex="http://schemas.microsoft.com/office/word/2018/wordml/cex" xmlns:w16cid="http://schemas.microsoft.com/office/word/2016/wordml/cid" xmlns:w16="http://schemas.microsoft.com/office/word/2018/wordml" xmlns:w16sdtdh="http://schemas.microsoft.com/office/word/2020/wordml/sdtdatahash" xmlns:w16se="http://schemas.microsoft.com/office/word/2015/wordml/symex" xmlns:wpg="http://schemas.microsoft.com/office/word/2010/wordprocessingGroup" xmlns:wpi="http://schemas.microsoft.com/office/word/2010/wordprocessingInk" xmlns:wne="http://schemas.microsoft.com/office/word/2006/wordml" xmlns:wps="http://schemas.microsoft.com/office/word/2010/wordprocessingShape" mc:Ignorable="w14 w15 w16se w16cid w16 w16cex w16sdtdh wp14">
   <w:footnote w:type="separator" w:id="-1">
@@ -6199,6 +5772,45 @@
     </w:p>
   </w:footnote>
 </w:footnotes>
+</file>
+
+<file path=word/header1.xml><?xml version="1.0" encoding="utf-8"?>
+<w:hdr xmlns:wpc="http://schemas.microsoft.com/office/word/2010/wordprocessingCanvas" xmlns:cx="http://schemas.microsoft.com/office/drawing/2014/chartex" xmlns:cx1="http://schemas.microsoft.com/office/drawing/2015/9/8/chartex" xmlns:cx2="http://schemas.microsoft.com/office/drawing/2015/10/21/chartex" xmlns:cx3="http://schemas.microsoft.com/office/drawing/2016/5/9/chartex" xmlns:cx4="http://schemas.microsoft.com/office/drawing/2016/5/10/chartex" xmlns:cx5="http://schemas.microsoft.com/office/drawing/2016/5/11/chartex" xmlns:cx6="http://schemas.microsoft.com/office/drawing/2016/5/12/chartex" xmlns:cx7="http://schemas.microsoft.com/office/drawing/2016/5/13/chartex" xmlns:cx8="http://schemas.microsoft.com/office/drawing/2016/5/14/chartex" xmlns:mc="http://schemas.openxmlformats.org/markup-compatibility/2006" xmlns:aink="http://schemas.microsoft.com/office/drawing/2016/ink" xmlns:am3d="http://schemas.microsoft.com/office/drawing/2017/model3d" xmlns:o="urn:schemas-microsoft-com:office:office" xmlns:oel="http://schemas.microsoft.com/office/2019/extlst" xmlns:r="http://schemas.openxmlformats.org/officeDocument/2006/relationships" xmlns:m="http://schemas.openxmlformats.org/officeDocument/2006/math" xmlns:v="urn:schemas-microsoft-com:vml" xmlns:wp14="http://schemas.microsoft.com/office/word/2010/wordprocessingDrawing" xmlns:wp="http://schemas.openxmlformats.org/drawingml/2006/wordprocessingDrawing" xmlns:w10="urn:schemas-microsoft-com:office:word" xmlns:w="http://schemas.openxmlformats.org/wordprocessingml/2006/main" xmlns:w14="http://schemas.microsoft.com/office/word/2010/wordml" xmlns:w15="http://schemas.microsoft.com/office/word/2012/wordml" xmlns:w16cex="http://schemas.microsoft.com/office/word/2018/wordml/cex" xmlns:w16cid="http://schemas.microsoft.com/office/word/2016/wordml/cid" xmlns:w16="http://schemas.microsoft.com/office/word/2018/wordml" xmlns:w16sdtdh="http://schemas.microsoft.com/office/word/2020/wordml/sdtdatahash" xmlns:w16se="http://schemas.microsoft.com/office/word/2015/wordml/symex" xmlns:wpg="http://schemas.microsoft.com/office/word/2010/wordprocessingGroup" xmlns:wpi="http://schemas.microsoft.com/office/word/2010/wordprocessingInk" xmlns:wne="http://schemas.microsoft.com/office/word/2006/wordml" xmlns:wps="http://schemas.microsoft.com/office/word/2010/wordprocessingShape" mc:Ignorable="w14 w15 w16se w16cid w16 w16cex w16sdtdh wp14">
+  <w:p>
+    <w:pPr>
+      <w:pStyle w:val="a7"/>
+      <w:rPr>
+        <w:rFonts w:hint="eastAsia"/>
+      </w:rPr>
+    </w:pPr>
+  </w:p>
+</w:hdr>
+</file>
+
+<file path=word/header2.xml><?xml version="1.0" encoding="utf-8"?>
+<w:hdr xmlns:wpc="http://schemas.microsoft.com/office/word/2010/wordprocessingCanvas" xmlns:cx="http://schemas.microsoft.com/office/drawing/2014/chartex" xmlns:cx1="http://schemas.microsoft.com/office/drawing/2015/9/8/chartex" xmlns:cx2="http://schemas.microsoft.com/office/drawing/2015/10/21/chartex" xmlns:cx3="http://schemas.microsoft.com/office/drawing/2016/5/9/chartex" xmlns:cx4="http://schemas.microsoft.com/office/drawing/2016/5/10/chartex" xmlns:cx5="http://schemas.microsoft.com/office/drawing/2016/5/11/chartex" xmlns:cx6="http://schemas.microsoft.com/office/drawing/2016/5/12/chartex" xmlns:cx7="http://schemas.microsoft.com/office/drawing/2016/5/13/chartex" xmlns:cx8="http://schemas.microsoft.com/office/drawing/2016/5/14/chartex" xmlns:mc="http://schemas.openxmlformats.org/markup-compatibility/2006" xmlns:aink="http://schemas.microsoft.com/office/drawing/2016/ink" xmlns:am3d="http://schemas.microsoft.com/office/drawing/2017/model3d" xmlns:o="urn:schemas-microsoft-com:office:office" xmlns:oel="http://schemas.microsoft.com/office/2019/extlst" xmlns:r="http://schemas.openxmlformats.org/officeDocument/2006/relationships" xmlns:m="http://schemas.openxmlformats.org/officeDocument/2006/math" xmlns:v="urn:schemas-microsoft-com:vml" xmlns:wp14="http://schemas.microsoft.com/office/word/2010/wordprocessingDrawing" xmlns:wp="http://schemas.openxmlformats.org/drawingml/2006/wordprocessingDrawing" xmlns:w10="urn:schemas-microsoft-com:office:word" xmlns:w="http://schemas.openxmlformats.org/wordprocessingml/2006/main" xmlns:w14="http://schemas.microsoft.com/office/word/2010/wordml" xmlns:w15="http://schemas.microsoft.com/office/word/2012/wordml" xmlns:w16cex="http://schemas.microsoft.com/office/word/2018/wordml/cex" xmlns:w16cid="http://schemas.microsoft.com/office/word/2016/wordml/cid" xmlns:w16="http://schemas.microsoft.com/office/word/2018/wordml" xmlns:w16sdtdh="http://schemas.microsoft.com/office/word/2020/wordml/sdtdatahash" xmlns:w16se="http://schemas.microsoft.com/office/word/2015/wordml/symex" xmlns:wpg="http://schemas.microsoft.com/office/word/2010/wordprocessingGroup" xmlns:wpi="http://schemas.microsoft.com/office/word/2010/wordprocessingInk" xmlns:wne="http://schemas.microsoft.com/office/word/2006/wordml" xmlns:wps="http://schemas.microsoft.com/office/word/2010/wordprocessingShape" mc:Ignorable="w14 w15 w16se w16cid w16 w16cex w16sdtdh wp14">
+  <w:p>
+    <w:pPr>
+      <w:pStyle w:val="a7"/>
+      <w:rPr>
+        <w:rFonts w:hint="eastAsia"/>
+      </w:rPr>
+    </w:pPr>
+  </w:p>
+</w:hdr>
+</file>
+
+<file path=word/header3.xml><?xml version="1.0" encoding="utf-8"?>
+<w:hdr xmlns:wpc="http://schemas.microsoft.com/office/word/2010/wordprocessingCanvas" xmlns:cx="http://schemas.microsoft.com/office/drawing/2014/chartex" xmlns:cx1="http://schemas.microsoft.com/office/drawing/2015/9/8/chartex" xmlns:cx2="http://schemas.microsoft.com/office/drawing/2015/10/21/chartex" xmlns:cx3="http://schemas.microsoft.com/office/drawing/2016/5/9/chartex" xmlns:cx4="http://schemas.microsoft.com/office/drawing/2016/5/10/chartex" xmlns:cx5="http://schemas.microsoft.com/office/drawing/2016/5/11/chartex" xmlns:cx6="http://schemas.microsoft.com/office/drawing/2016/5/12/chartex" xmlns:cx7="http://schemas.microsoft.com/office/drawing/2016/5/13/chartex" xmlns:cx8="http://schemas.microsoft.com/office/drawing/2016/5/14/chartex" xmlns:mc="http://schemas.openxmlformats.org/markup-compatibility/2006" xmlns:aink="http://schemas.microsoft.com/office/drawing/2016/ink" xmlns:am3d="http://schemas.microsoft.com/office/drawing/2017/model3d" xmlns:o="urn:schemas-microsoft-com:office:office" xmlns:oel="http://schemas.microsoft.com/office/2019/extlst" xmlns:r="http://schemas.openxmlformats.org/officeDocument/2006/relationships" xmlns:m="http://schemas.openxmlformats.org/officeDocument/2006/math" xmlns:v="urn:schemas-microsoft-com:vml" xmlns:wp14="http://schemas.microsoft.com/office/word/2010/wordprocessingDrawing" xmlns:wp="http://schemas.openxmlformats.org/drawingml/2006/wordprocessingDrawing" xmlns:w10="urn:schemas-microsoft-com:office:word" xmlns:w="http://schemas.openxmlformats.org/wordprocessingml/2006/main" xmlns:w14="http://schemas.microsoft.com/office/word/2010/wordml" xmlns:w15="http://schemas.microsoft.com/office/word/2012/wordml" xmlns:w16cex="http://schemas.microsoft.com/office/word/2018/wordml/cex" xmlns:w16cid="http://schemas.microsoft.com/office/word/2016/wordml/cid" xmlns:w16="http://schemas.microsoft.com/office/word/2018/wordml" xmlns:w16sdtdh="http://schemas.microsoft.com/office/word/2020/wordml/sdtdatahash" xmlns:w16se="http://schemas.microsoft.com/office/word/2015/wordml/symex" xmlns:wpg="http://schemas.microsoft.com/office/word/2010/wordprocessingGroup" xmlns:wpi="http://schemas.microsoft.com/office/word/2010/wordprocessingInk" xmlns:wne="http://schemas.microsoft.com/office/word/2006/wordml" xmlns:wps="http://schemas.microsoft.com/office/word/2010/wordprocessingShape" mc:Ignorable="w14 w15 w16se w16cid w16 w16cex w16sdtdh wp14">
+  <w:p>
+    <w:pPr>
+      <w:pStyle w:val="a7"/>
+      <w:rPr>
+        <w:rFonts w:hint="eastAsia"/>
+      </w:rPr>
+    </w:pPr>
+  </w:p>
+</w:hdr>
 </file>
 
 <file path=word/numbering.xml><?xml version="1.0" encoding="utf-8"?>

</xml_diff>